<commit_message>
Rever relatorio Meta I com tabelas de arquiteturas
</commit_message>
<xml_diff>
--- a/entrega/relatorio_meta1.docx
+++ b/entrega/relatorio_meta1.docx
@@ -13,15 +13,15 @@
     <w:p>
       <w:r>
         <w:rPr>
-          <w:color w:val="1D6147"/>
-          <w:sz w:val="32"/>
+          <w:color w:val="2D4571"/>
+          <w:sz w:val="30"/>
         </w:rPr>
-        <w:t>Classificação de cinco espécies de plantas em fotografias</w:t>
+        <w:t>Identificação de cinco espécies de plantas por classificação de imagens</w:t>
       </w:r>
     </w:p>
     <w:p>
       <w:r>
-        <w:t>Relatório técnico — Meta I · Inteligência Computacional · 2026/27</w:t>
+        <w:t>Projeto de Inteligência Computacional — Meta I · 2026/27</w:t>
       </w:r>
     </w:p>
     <w:p/>
@@ -37,7 +37,7 @@
     </w:p>
     <w:p>
       <w:r>
-        <w:t>Licenciatura em Engenharia Informática · Professor Carlos Pereira</w:t>
+        <w:t>Licenciatura em Engenharia Informática · Docente: Carlos Pereira</w:t>
       </w:r>
     </w:p>
     <w:p>
@@ -56,12 +56,12 @@
     </w:p>
     <w:p>
       <w:r>
-        <w:t>O HikeFlora estuda a identificação visual de cinco espécies de plantas relevantes para caminhadas. Foram selecionadas 11 000 fotografias do Pl@ntNet-300K-v2, com classes equilibradas e partições independentes de treino, validação e teste. Compararam-se uma MLP e várias CNN simples. A CNN com dropout foi escolhida pela menor perda de validação e alcançou 74,00% de accuracy e 74,25% de F1 macro em 1 100 imagens de teste. A classificação visual não determina se uma planta é segura para ingestão ou contacto.</w:t>
+        <w:t>O HikeFlora estuda a identificação visual de cinco espécies de plantas a partir de uma fotografia. Foram selecionadas 11 000 imagens do Pl@ntNet-300K-v2, equilibradas entre as espécies e separadas em treino, validação e teste. Treinou-se uma MLP e uma CNN, seguida de três variações da CNN para reduzir o sobreajuste. A escolha pela menor perda de validação conduziu à CNN com dropout, que obteve 74,00% de accuracy e 74,25% de F1 macro em 1 100 imagens de teste independente. A classificação abrange apenas cinco espécies e não avalia a segurança de ingestão ou contacto.</w:t>
       </w:r>
     </w:p>
     <w:p>
       <w:r>
-        <w:t>Palavras-chave: classificação de imagens; plantas; MLP; CNN; validação; matriz de confusão.</w:t>
+        <w:t>Palavras-chave: plantas; classificação de imagens; MLP; CNN; validação; teste independente.</w:t>
       </w:r>
     </w:p>
     <w:p>
@@ -82,12 +82,12 @@
         <w:pStyle w:val="Heading2"/>
       </w:pPr>
       <w:r>
-        <w:t>1.1 Problema e âmbito</w:t>
+        <w:t>1.1. Problema e âmbito</w:t>
       </w:r>
     </w:p>
     <w:p>
       <w:r>
-        <w:t>Durante uma caminhada, uma pessoa pode ter dificuldade em reconhecer uma planta. O objetivo desta Meta I é prever, a partir de uma fotografia, qual das cinco espécies abrangidas é a mais provável: gerânio (Pelargonium zonale), alfazema (Lavandula angustifolia), papoila (Papaver rhoeas), trevo-branco (Trifolium repens) ou morangueiro silvestre (Fragaria vesca). A apresentação inicial do HikeFlora prevê, para fases posteriores, fichas documentadas sobre ingestão e contacto, alternativas e um resultado inconclusivo. Essas funcionalidades não foram implementadas nesta Meta I. Uma previsão não é uma recomendação de consumo [1, 2].</w:t>
+        <w:t>Uma pessoa em caminhada pode querer identificar uma planta que fotografou. Nesta Meta I, o objetivo é prever a espécie mais provável entre cinco classes: gerânio, alfazema, papoila, trevo-branco e morangueiro silvestre. A saída do modelo é uma das cinco classes, não uma identificação aberta de toda a flora. O projeto da aplicação prevê, para fases posteriores, um resultado inconclusivo e fichas documentadas sobre ingestão e contacto [1, 2]. Estas funcionalidades ainda não fazem parte do classificador; uma previsão visual não indica que uma planta seja segura.</w:t>
       </w:r>
     </w:p>
     <w:p>
@@ -95,43 +95,54 @@
         <w:pStyle w:val="Heading2"/>
       </w:pPr>
       <w:r>
-        <w:t>1.2 Origem e caracterização dos dados</w:t>
+        <w:t>1.2. Origem e composição dos dados</w:t>
       </w:r>
     </w:p>
     <w:p>
       <w:r>
-        <w:t>A fonte é o Pl@ntNet-300K-v2, com 306 087 imagens de 1 000 espécies [3]. Este trabalho usa um subconjunto próprio de 11 000 fotografias. Foi mantida a separação original em treino, validação e teste. De cada classe foram escolhidas 2 200 imagens com semente 42: 1 760 para treino, 220 para validação e 220 para teste. Assim, cada classe representa 20% de cada partição.</w:t>
+        <w:t>O Pl@ntNet-300K-v2 reúne 306 087 imagens de 1 000 espécies e fornece partições oficiais de treino, validação e teste [3]. O conjunto completo é um benchmark caracterizado por desequilíbrio entre espécies e semelhança visual entre algumas plantas [3, 4]. O nosso subconjunto equilibrado de cinco espécies constitui outra tarefa; não identificámos um resultado publicado diretamente comparável para esta seleção. Por isso, usamos a MLP e a CNN como referências internas, sem apresentar os resultados das 1 000 classes como desempenho esperado do HikeFlora.</w:t>
+      </w:r>
+    </w:p>
+    <w:p>
+      <w:r>
+        <w:t>Tabela 1 — Espécies escolhidas. As famílias constam de species_metadata.csv; cada linha tem 2 200 imagens selecionadas.</w:t>
       </w:r>
     </w:p>
     <w:tbl>
       <w:tblPr>
-        <w:tblStyle w:val="LightShading-Accent1"/>
         <w:tblW w:type="auto" w:w="0"/>
         <w:jc w:val="center"/>
+        <w:tblLayout w:type="fixed"/>
         <w:tblLook w:firstColumn="1" w:firstRow="1" w:lastColumn="0" w:lastRow="0" w:noHBand="0" w:noVBand="1" w:val="04A0"/>
       </w:tblPr>
       <w:tblGrid>
-        <w:gridCol w:w="1681"/>
-        <w:gridCol w:w="1681"/>
-        <w:gridCol w:w="1681"/>
-        <w:gridCol w:w="1681"/>
-        <w:gridCol w:w="1681"/>
-        <w:gridCol w:w="1681"/>
+        <w:gridCol w:w="1409"/>
+        <w:gridCol w:w="1409"/>
+        <w:gridCol w:w="1409"/>
+        <w:gridCol w:w="1409"/>
+        <w:gridCol w:w="1409"/>
+        <w:gridCol w:w="1409"/>
+        <w:gridCol w:w="1409"/>
       </w:tblGrid>
       <w:tr>
+        <w:trPr>
+          <w:cantSplit/>
+        </w:trPr>
         <w:tc>
           <w:tcPr>
-            <w:tcW w:type="dxa" w:w="1681"/>
+            <w:tcW w:type="dxa" w:w="397"/>
+            <w:vAlign w:val="center"/>
+            <w:shd w:fill="DCE5F2"/>
           </w:tcPr>
           <w:p>
             <w:pPr>
-              <w:spacing w:after="20"/>
+              <w:spacing w:after="20" w:before="20"/>
             </w:pPr>
             <w:r>
               <w:rPr>
                 <w:b/>
-                <w:color w:val="1D6147"/>
-                <w:sz w:val="16"/>
+                <w:color w:val="2D4571"/>
+                <w:sz w:val="15"/>
               </w:rPr>
               <w:t>ID</w:t>
             </w:r>
@@ -139,35 +150,79 @@
         </w:tc>
         <w:tc>
           <w:tcPr>
-            <w:tcW w:type="dxa" w:w="1681"/>
+            <w:tcW w:type="dxa" w:w="1417"/>
+            <w:vAlign w:val="center"/>
+            <w:shd w:fill="DCE5F2"/>
           </w:tcPr>
           <w:p>
             <w:pPr>
-              <w:spacing w:after="20"/>
+              <w:spacing w:after="20" w:before="20"/>
             </w:pPr>
             <w:r>
               <w:rPr>
                 <w:b/>
-                <w:color w:val="1D6147"/>
-                <w:sz w:val="16"/>
+                <w:color w:val="2D4571"/>
+                <w:sz w:val="15"/>
               </w:rPr>
-              <w:t>Espécie</w:t>
+              <w:t>Nome comum</w:t>
             </w:r>
           </w:p>
         </w:tc>
         <w:tc>
           <w:tcPr>
-            <w:tcW w:type="dxa" w:w="1681"/>
+            <w:tcW w:type="dxa" w:w="2041"/>
+            <w:vAlign w:val="center"/>
+            <w:shd w:fill="DCE5F2"/>
           </w:tcPr>
           <w:p>
             <w:pPr>
-              <w:spacing w:after="20"/>
+              <w:spacing w:after="20" w:before="20"/>
             </w:pPr>
             <w:r>
               <w:rPr>
                 <w:b/>
-                <w:color w:val="1D6147"/>
-                <w:sz w:val="16"/>
+                <w:color w:val="2D4571"/>
+                <w:sz w:val="15"/>
+              </w:rPr>
+              <w:t>Nome científico</w:t>
+            </w:r>
+          </w:p>
+        </w:tc>
+        <w:tc>
+          <w:tcPr>
+            <w:tcW w:type="dxa" w:w="1417"/>
+            <w:vAlign w:val="center"/>
+            <w:shd w:fill="DCE5F2"/>
+          </w:tcPr>
+          <w:p>
+            <w:pPr>
+              <w:spacing w:after="20" w:before="20"/>
+            </w:pPr>
+            <w:r>
+              <w:rPr>
+                <w:b/>
+                <w:color w:val="2D4571"/>
+                <w:sz w:val="15"/>
+              </w:rPr>
+              <w:t>Família</w:t>
+            </w:r>
+          </w:p>
+        </w:tc>
+        <w:tc>
+          <w:tcPr>
+            <w:tcW w:type="dxa" w:w="680"/>
+            <w:vAlign w:val="center"/>
+            <w:shd w:fill="DCE5F2"/>
+          </w:tcPr>
+          <w:p>
+            <w:pPr>
+              <w:spacing w:after="20" w:before="20"/>
+            </w:pPr>
+            <w:r>
+              <w:rPr>
+                <w:b/>
+                <w:color w:val="2D4571"/>
+                <w:sz w:val="15"/>
               </w:rPr>
               <w:t>Treino</w:t>
             </w:r>
@@ -175,71 +230,61 @@
         </w:tc>
         <w:tc>
           <w:tcPr>
-            <w:tcW w:type="dxa" w:w="1681"/>
+            <w:tcW w:type="dxa" w:w="567"/>
+            <w:vAlign w:val="center"/>
+            <w:shd w:fill="DCE5F2"/>
           </w:tcPr>
           <w:p>
             <w:pPr>
-              <w:spacing w:after="20"/>
+              <w:spacing w:after="20" w:before="20"/>
             </w:pPr>
             <w:r>
               <w:rPr>
                 <w:b/>
-                <w:color w:val="1D6147"/>
-                <w:sz w:val="16"/>
+                <w:color w:val="2D4571"/>
+                <w:sz w:val="15"/>
               </w:rPr>
-              <w:t>Validação</w:t>
+              <w:t>Val.</w:t>
             </w:r>
           </w:p>
         </w:tc>
         <w:tc>
           <w:tcPr>
-            <w:tcW w:type="dxa" w:w="1681"/>
+            <w:tcW w:type="dxa" w:w="567"/>
+            <w:vAlign w:val="center"/>
+            <w:shd w:fill="DCE5F2"/>
           </w:tcPr>
           <w:p>
             <w:pPr>
-              <w:spacing w:after="20"/>
+              <w:spacing w:after="20" w:before="20"/>
             </w:pPr>
             <w:r>
               <w:rPr>
                 <w:b/>
-                <w:color w:val="1D6147"/>
-                <w:sz w:val="16"/>
+                <w:color w:val="2D4571"/>
+                <w:sz w:val="15"/>
               </w:rPr>
               <w:t>Teste</w:t>
             </w:r>
           </w:p>
         </w:tc>
+      </w:tr>
+      <w:tr>
+        <w:trPr>
+          <w:cantSplit/>
+        </w:trPr>
         <w:tc>
           <w:tcPr>
-            <w:tcW w:type="dxa" w:w="1681"/>
+            <w:tcW w:type="dxa" w:w="397"/>
+            <w:vAlign w:val="center"/>
           </w:tcPr>
           <w:p>
             <w:pPr>
-              <w:spacing w:after="20"/>
+              <w:spacing w:after="20" w:before="20"/>
             </w:pPr>
             <w:r>
               <w:rPr>
-                <w:b/>
-                <w:color w:val="1D6147"/>
-                <w:sz w:val="16"/>
-              </w:rPr>
-              <w:t>Total</w:t>
-            </w:r>
-          </w:p>
-        </w:tc>
-      </w:tr>
-      <w:tr>
-        <w:tc>
-          <w:tcPr>
-            <w:tcW w:type="dxa" w:w="1681"/>
-          </w:tcPr>
-          <w:p>
-            <w:pPr>
-              <w:spacing w:after="20"/>
-            </w:pPr>
-            <w:r>
-              <w:rPr>
-                <w:sz w:val="16"/>
+                <w:sz w:val="15"/>
               </w:rPr>
               <w:t>8</w:t>
             </w:r>
@@ -247,15 +292,16 @@
         </w:tc>
         <w:tc>
           <w:tcPr>
-            <w:tcW w:type="dxa" w:w="1681"/>
+            <w:tcW w:type="dxa" w:w="1417"/>
+            <w:vAlign w:val="center"/>
           </w:tcPr>
           <w:p>
             <w:pPr>
-              <w:spacing w:after="20"/>
+              <w:spacing w:after="20" w:before="20"/>
             </w:pPr>
             <w:r>
               <w:rPr>
-                <w:sz w:val="16"/>
+                <w:sz w:val="15"/>
               </w:rPr>
               <w:t>Gerânio</w:t>
             </w:r>
@@ -263,15 +309,50 @@
         </w:tc>
         <w:tc>
           <w:tcPr>
-            <w:tcW w:type="dxa" w:w="1681"/>
+            <w:tcW w:type="dxa" w:w="2041"/>
+            <w:vAlign w:val="center"/>
           </w:tcPr>
           <w:p>
             <w:pPr>
-              <w:spacing w:after="20"/>
+              <w:spacing w:after="20" w:before="20"/>
             </w:pPr>
             <w:r>
               <w:rPr>
-                <w:sz w:val="16"/>
+                <w:sz w:val="15"/>
+              </w:rPr>
+              <w:t>Pelargonium zonale</w:t>
+            </w:r>
+          </w:p>
+        </w:tc>
+        <w:tc>
+          <w:tcPr>
+            <w:tcW w:type="dxa" w:w="1417"/>
+            <w:vAlign w:val="center"/>
+          </w:tcPr>
+          <w:p>
+            <w:pPr>
+              <w:spacing w:after="20" w:before="20"/>
+            </w:pPr>
+            <w:r>
+              <w:rPr>
+                <w:sz w:val="15"/>
+              </w:rPr>
+              <w:t>Geraniaceae</w:t>
+            </w:r>
+          </w:p>
+        </w:tc>
+        <w:tc>
+          <w:tcPr>
+            <w:tcW w:type="dxa" w:w="680"/>
+            <w:vAlign w:val="center"/>
+          </w:tcPr>
+          <w:p>
+            <w:pPr>
+              <w:spacing w:after="20" w:before="20"/>
+            </w:pPr>
+            <w:r>
+              <w:rPr>
+                <w:sz w:val="15"/>
               </w:rPr>
               <w:t>1 760</w:t>
             </w:r>
@@ -279,15 +360,16 @@
         </w:tc>
         <w:tc>
           <w:tcPr>
-            <w:tcW w:type="dxa" w:w="1681"/>
+            <w:tcW w:type="dxa" w:w="567"/>
+            <w:vAlign w:val="center"/>
           </w:tcPr>
           <w:p>
             <w:pPr>
-              <w:spacing w:after="20"/>
+              <w:spacing w:after="20" w:before="20"/>
             </w:pPr>
             <w:r>
               <w:rPr>
-                <w:sz w:val="16"/>
+                <w:sz w:val="15"/>
               </w:rPr>
               <w:t>220</w:t>
             </w:r>
@@ -295,15 +377,129 @@
         </w:tc>
         <w:tc>
           <w:tcPr>
-            <w:tcW w:type="dxa" w:w="1681"/>
+            <w:tcW w:type="dxa" w:w="567"/>
+            <w:vAlign w:val="center"/>
           </w:tcPr>
           <w:p>
             <w:pPr>
-              <w:spacing w:after="20"/>
+              <w:spacing w:after="20" w:before="20"/>
             </w:pPr>
             <w:r>
               <w:rPr>
-                <w:sz w:val="16"/>
+                <w:sz w:val="15"/>
+              </w:rPr>
+              <w:t>220</w:t>
+            </w:r>
+          </w:p>
+        </w:tc>
+      </w:tr>
+      <w:tr>
+        <w:trPr>
+          <w:cantSplit/>
+        </w:trPr>
+        <w:tc>
+          <w:tcPr>
+            <w:tcW w:type="dxa" w:w="397"/>
+            <w:vAlign w:val="center"/>
+            <w:shd w:fill="F2F5F9"/>
+          </w:tcPr>
+          <w:p>
+            <w:pPr>
+              <w:spacing w:after="20" w:before="20"/>
+            </w:pPr>
+            <w:r>
+              <w:rPr>
+                <w:sz w:val="15"/>
+              </w:rPr>
+              <w:t>172</w:t>
+            </w:r>
+          </w:p>
+        </w:tc>
+        <w:tc>
+          <w:tcPr>
+            <w:tcW w:type="dxa" w:w="1417"/>
+            <w:vAlign w:val="center"/>
+            <w:shd w:fill="F2F5F9"/>
+          </w:tcPr>
+          <w:p>
+            <w:pPr>
+              <w:spacing w:after="20" w:before="20"/>
+            </w:pPr>
+            <w:r>
+              <w:rPr>
+                <w:sz w:val="15"/>
+              </w:rPr>
+              <w:t>Alfazema</w:t>
+            </w:r>
+          </w:p>
+        </w:tc>
+        <w:tc>
+          <w:tcPr>
+            <w:tcW w:type="dxa" w:w="2041"/>
+            <w:vAlign w:val="center"/>
+            <w:shd w:fill="F2F5F9"/>
+          </w:tcPr>
+          <w:p>
+            <w:pPr>
+              <w:spacing w:after="20" w:before="20"/>
+            </w:pPr>
+            <w:r>
+              <w:rPr>
+                <w:sz w:val="15"/>
+              </w:rPr>
+              <w:t>Lavandula angustifolia</w:t>
+            </w:r>
+          </w:p>
+        </w:tc>
+        <w:tc>
+          <w:tcPr>
+            <w:tcW w:type="dxa" w:w="1417"/>
+            <w:vAlign w:val="center"/>
+            <w:shd w:fill="F2F5F9"/>
+          </w:tcPr>
+          <w:p>
+            <w:pPr>
+              <w:spacing w:after="20" w:before="20"/>
+            </w:pPr>
+            <w:r>
+              <w:rPr>
+                <w:sz w:val="15"/>
+              </w:rPr>
+              <w:t>Lamiaceae</w:t>
+            </w:r>
+          </w:p>
+        </w:tc>
+        <w:tc>
+          <w:tcPr>
+            <w:tcW w:type="dxa" w:w="680"/>
+            <w:vAlign w:val="center"/>
+            <w:shd w:fill="F2F5F9"/>
+          </w:tcPr>
+          <w:p>
+            <w:pPr>
+              <w:spacing w:after="20" w:before="20"/>
+            </w:pPr>
+            <w:r>
+              <w:rPr>
+                <w:sz w:val="15"/>
+              </w:rPr>
+              <w:t>1 760</w:t>
+            </w:r>
+          </w:p>
+        </w:tc>
+        <w:tc>
+          <w:tcPr>
+            <w:tcW w:type="dxa" w:w="567"/>
+            <w:vAlign w:val="center"/>
+            <w:shd w:fill="F2F5F9"/>
+          </w:tcPr>
+          <w:p>
+            <w:pPr>
+              <w:spacing w:after="20" w:before="20"/>
+            </w:pPr>
+            <w:r>
+              <w:rPr>
+                <w:sz w:val="15"/>
               </w:rPr>
               <w:t>220</w:t>
             </w:r>
@@ -311,65 +507,107 @@
         </w:tc>
         <w:tc>
           <w:tcPr>
-            <w:tcW w:type="dxa" w:w="1681"/>
+            <w:tcW w:type="dxa" w:w="567"/>
+            <w:vAlign w:val="center"/>
+            <w:shd w:fill="F2F5F9"/>
           </w:tcPr>
           <w:p>
             <w:pPr>
-              <w:spacing w:after="20"/>
+              <w:spacing w:after="20" w:before="20"/>
             </w:pPr>
             <w:r>
               <w:rPr>
-                <w:sz w:val="16"/>
+                <w:sz w:val="15"/>
               </w:rPr>
-              <w:t>2 200</w:t>
+              <w:t>220</w:t>
             </w:r>
           </w:p>
         </w:tc>
       </w:tr>
       <w:tr>
+        <w:trPr>
+          <w:cantSplit/>
+        </w:trPr>
         <w:tc>
           <w:tcPr>
-            <w:tcW w:type="dxa" w:w="1681"/>
+            <w:tcW w:type="dxa" w:w="397"/>
+            <w:vAlign w:val="center"/>
           </w:tcPr>
           <w:p>
             <w:pPr>
-              <w:spacing w:after="20"/>
+              <w:spacing w:after="20" w:before="20"/>
             </w:pPr>
             <w:r>
               <w:rPr>
-                <w:sz w:val="16"/>
+                <w:sz w:val="15"/>
               </w:rPr>
-              <w:t>172</w:t>
+              <w:t>200</w:t>
             </w:r>
           </w:p>
         </w:tc>
         <w:tc>
           <w:tcPr>
-            <w:tcW w:type="dxa" w:w="1681"/>
+            <w:tcW w:type="dxa" w:w="1417"/>
+            <w:vAlign w:val="center"/>
           </w:tcPr>
           <w:p>
             <w:pPr>
-              <w:spacing w:after="20"/>
+              <w:spacing w:after="20" w:before="20"/>
             </w:pPr>
             <w:r>
               <w:rPr>
-                <w:sz w:val="16"/>
+                <w:sz w:val="15"/>
               </w:rPr>
-              <w:t>Alfazema</w:t>
+              <w:t>Papoila</w:t>
             </w:r>
           </w:p>
         </w:tc>
         <w:tc>
           <w:tcPr>
-            <w:tcW w:type="dxa" w:w="1681"/>
+            <w:tcW w:type="dxa" w:w="2041"/>
+            <w:vAlign w:val="center"/>
           </w:tcPr>
           <w:p>
             <w:pPr>
-              <w:spacing w:after="20"/>
+              <w:spacing w:after="20" w:before="20"/>
             </w:pPr>
             <w:r>
               <w:rPr>
-                <w:sz w:val="16"/>
+                <w:sz w:val="15"/>
+              </w:rPr>
+              <w:t>Papaver rhoeas</w:t>
+            </w:r>
+          </w:p>
+        </w:tc>
+        <w:tc>
+          <w:tcPr>
+            <w:tcW w:type="dxa" w:w="1417"/>
+            <w:vAlign w:val="center"/>
+          </w:tcPr>
+          <w:p>
+            <w:pPr>
+              <w:spacing w:after="20" w:before="20"/>
+            </w:pPr>
+            <w:r>
+              <w:rPr>
+                <w:sz w:val="15"/>
+              </w:rPr>
+              <w:t>Papaveraceae</w:t>
+            </w:r>
+          </w:p>
+        </w:tc>
+        <w:tc>
+          <w:tcPr>
+            <w:tcW w:type="dxa" w:w="680"/>
+            <w:vAlign w:val="center"/>
+          </w:tcPr>
+          <w:p>
+            <w:pPr>
+              <w:spacing w:after="20" w:before="20"/>
+            </w:pPr>
+            <w:r>
+              <w:rPr>
+                <w:sz w:val="15"/>
               </w:rPr>
               <w:t>1 760</w:t>
             </w:r>
@@ -377,15 +615,16 @@
         </w:tc>
         <w:tc>
           <w:tcPr>
-            <w:tcW w:type="dxa" w:w="1681"/>
+            <w:tcW w:type="dxa" w:w="567"/>
+            <w:vAlign w:val="center"/>
           </w:tcPr>
           <w:p>
             <w:pPr>
-              <w:spacing w:after="20"/>
+              <w:spacing w:after="20" w:before="20"/>
             </w:pPr>
             <w:r>
               <w:rPr>
-                <w:sz w:val="16"/>
+                <w:sz w:val="15"/>
               </w:rPr>
               <w:t>220</w:t>
             </w:r>
@@ -393,15 +632,129 @@
         </w:tc>
         <w:tc>
           <w:tcPr>
-            <w:tcW w:type="dxa" w:w="1681"/>
+            <w:tcW w:type="dxa" w:w="567"/>
+            <w:vAlign w:val="center"/>
           </w:tcPr>
           <w:p>
             <w:pPr>
-              <w:spacing w:after="20"/>
+              <w:spacing w:after="20" w:before="20"/>
             </w:pPr>
             <w:r>
               <w:rPr>
-                <w:sz w:val="16"/>
+                <w:sz w:val="15"/>
+              </w:rPr>
+              <w:t>220</w:t>
+            </w:r>
+          </w:p>
+        </w:tc>
+      </w:tr>
+      <w:tr>
+        <w:trPr>
+          <w:cantSplit/>
+        </w:trPr>
+        <w:tc>
+          <w:tcPr>
+            <w:tcW w:type="dxa" w:w="397"/>
+            <w:vAlign w:val="center"/>
+            <w:shd w:fill="F2F5F9"/>
+          </w:tcPr>
+          <w:p>
+            <w:pPr>
+              <w:spacing w:after="20" w:before="20"/>
+            </w:pPr>
+            <w:r>
+              <w:rPr>
+                <w:sz w:val="15"/>
+              </w:rPr>
+              <w:t>225</w:t>
+            </w:r>
+          </w:p>
+        </w:tc>
+        <w:tc>
+          <w:tcPr>
+            <w:tcW w:type="dxa" w:w="1417"/>
+            <w:vAlign w:val="center"/>
+            <w:shd w:fill="F2F5F9"/>
+          </w:tcPr>
+          <w:p>
+            <w:pPr>
+              <w:spacing w:after="20" w:before="20"/>
+            </w:pPr>
+            <w:r>
+              <w:rPr>
+                <w:sz w:val="15"/>
+              </w:rPr>
+              <w:t>Trevo-branco</w:t>
+            </w:r>
+          </w:p>
+        </w:tc>
+        <w:tc>
+          <w:tcPr>
+            <w:tcW w:type="dxa" w:w="2041"/>
+            <w:vAlign w:val="center"/>
+            <w:shd w:fill="F2F5F9"/>
+          </w:tcPr>
+          <w:p>
+            <w:pPr>
+              <w:spacing w:after="20" w:before="20"/>
+            </w:pPr>
+            <w:r>
+              <w:rPr>
+                <w:sz w:val="15"/>
+              </w:rPr>
+              <w:t>Trifolium repens</w:t>
+            </w:r>
+          </w:p>
+        </w:tc>
+        <w:tc>
+          <w:tcPr>
+            <w:tcW w:type="dxa" w:w="1417"/>
+            <w:vAlign w:val="center"/>
+            <w:shd w:fill="F2F5F9"/>
+          </w:tcPr>
+          <w:p>
+            <w:pPr>
+              <w:spacing w:after="20" w:before="20"/>
+            </w:pPr>
+            <w:r>
+              <w:rPr>
+                <w:sz w:val="15"/>
+              </w:rPr>
+              <w:t>Fabaceae</w:t>
+            </w:r>
+          </w:p>
+        </w:tc>
+        <w:tc>
+          <w:tcPr>
+            <w:tcW w:type="dxa" w:w="680"/>
+            <w:vAlign w:val="center"/>
+            <w:shd w:fill="F2F5F9"/>
+          </w:tcPr>
+          <w:p>
+            <w:pPr>
+              <w:spacing w:after="20" w:before="20"/>
+            </w:pPr>
+            <w:r>
+              <w:rPr>
+                <w:sz w:val="15"/>
+              </w:rPr>
+              <w:t>1 760</w:t>
+            </w:r>
+          </w:p>
+        </w:tc>
+        <w:tc>
+          <w:tcPr>
+            <w:tcW w:type="dxa" w:w="567"/>
+            <w:vAlign w:val="center"/>
+            <w:shd w:fill="F2F5F9"/>
+          </w:tcPr>
+          <w:p>
+            <w:pPr>
+              <w:spacing w:after="20" w:before="20"/>
+            </w:pPr>
+            <w:r>
+              <w:rPr>
+                <w:sz w:val="15"/>
               </w:rPr>
               <w:t>220</w:t>
             </w:r>
@@ -409,65 +762,107 @@
         </w:tc>
         <w:tc>
           <w:tcPr>
-            <w:tcW w:type="dxa" w:w="1681"/>
+            <w:tcW w:type="dxa" w:w="567"/>
+            <w:vAlign w:val="center"/>
+            <w:shd w:fill="F2F5F9"/>
           </w:tcPr>
           <w:p>
             <w:pPr>
-              <w:spacing w:after="20"/>
+              <w:spacing w:after="20" w:before="20"/>
             </w:pPr>
             <w:r>
               <w:rPr>
-                <w:sz w:val="16"/>
+                <w:sz w:val="15"/>
               </w:rPr>
-              <w:t>2 200</w:t>
+              <w:t>220</w:t>
             </w:r>
           </w:p>
         </w:tc>
       </w:tr>
       <w:tr>
+        <w:trPr>
+          <w:cantSplit/>
+        </w:trPr>
         <w:tc>
           <w:tcPr>
-            <w:tcW w:type="dxa" w:w="1681"/>
+            <w:tcW w:type="dxa" w:w="397"/>
+            <w:vAlign w:val="center"/>
           </w:tcPr>
           <w:p>
             <w:pPr>
-              <w:spacing w:after="20"/>
+              <w:spacing w:after="20" w:before="20"/>
             </w:pPr>
             <w:r>
               <w:rPr>
-                <w:sz w:val="16"/>
+                <w:sz w:val="15"/>
               </w:rPr>
-              <w:t>200</w:t>
+              <w:t>237</w:t>
             </w:r>
           </w:p>
         </w:tc>
         <w:tc>
           <w:tcPr>
-            <w:tcW w:type="dxa" w:w="1681"/>
+            <w:tcW w:type="dxa" w:w="1417"/>
+            <w:vAlign w:val="center"/>
           </w:tcPr>
           <w:p>
             <w:pPr>
-              <w:spacing w:after="20"/>
+              <w:spacing w:after="20" w:before="20"/>
             </w:pPr>
             <w:r>
               <w:rPr>
-                <w:sz w:val="16"/>
+                <w:sz w:val="15"/>
               </w:rPr>
-              <w:t>Papoila</w:t>
+              <w:t>Morangueiro silvestre</w:t>
             </w:r>
           </w:p>
         </w:tc>
         <w:tc>
           <w:tcPr>
-            <w:tcW w:type="dxa" w:w="1681"/>
+            <w:tcW w:type="dxa" w:w="2041"/>
+            <w:vAlign w:val="center"/>
           </w:tcPr>
           <w:p>
             <w:pPr>
-              <w:spacing w:after="20"/>
+              <w:spacing w:after="20" w:before="20"/>
             </w:pPr>
             <w:r>
               <w:rPr>
-                <w:sz w:val="16"/>
+                <w:sz w:val="15"/>
+              </w:rPr>
+              <w:t>Fragaria vesca</w:t>
+            </w:r>
+          </w:p>
+        </w:tc>
+        <w:tc>
+          <w:tcPr>
+            <w:tcW w:type="dxa" w:w="1417"/>
+            <w:vAlign w:val="center"/>
+          </w:tcPr>
+          <w:p>
+            <w:pPr>
+              <w:spacing w:after="20" w:before="20"/>
+            </w:pPr>
+            <w:r>
+              <w:rPr>
+                <w:sz w:val="15"/>
+              </w:rPr>
+              <w:t>Rosaceae</w:t>
+            </w:r>
+          </w:p>
+        </w:tc>
+        <w:tc>
+          <w:tcPr>
+            <w:tcW w:type="dxa" w:w="680"/>
+            <w:vAlign w:val="center"/>
+          </w:tcPr>
+          <w:p>
+            <w:pPr>
+              <w:spacing w:after="20" w:before="20"/>
+            </w:pPr>
+            <w:r>
+              <w:rPr>
+                <w:sz w:val="15"/>
               </w:rPr>
               <w:t>1 760</w:t>
             </w:r>
@@ -475,15 +870,16 @@
         </w:tc>
         <w:tc>
           <w:tcPr>
-            <w:tcW w:type="dxa" w:w="1681"/>
+            <w:tcW w:type="dxa" w:w="567"/>
+            <w:vAlign w:val="center"/>
           </w:tcPr>
           <w:p>
             <w:pPr>
-              <w:spacing w:after="20"/>
+              <w:spacing w:after="20" w:before="20"/>
             </w:pPr>
             <w:r>
               <w:rPr>
-                <w:sz w:val="16"/>
+                <w:sz w:val="15"/>
               </w:rPr>
               <w:t>220</w:t>
             </w:r>
@@ -491,245 +887,39 @@
         </w:tc>
         <w:tc>
           <w:tcPr>
-            <w:tcW w:type="dxa" w:w="1681"/>
+            <w:tcW w:type="dxa" w:w="567"/>
+            <w:vAlign w:val="center"/>
           </w:tcPr>
           <w:p>
             <w:pPr>
-              <w:spacing w:after="20"/>
+              <w:spacing w:after="20" w:before="20"/>
             </w:pPr>
             <w:r>
               <w:rPr>
-                <w:sz w:val="16"/>
+                <w:sz w:val="15"/>
               </w:rPr>
               <w:t>220</w:t>
             </w:r>
           </w:p>
         </w:tc>
+      </w:tr>
+      <w:tr>
+        <w:trPr>
+          <w:cantSplit/>
+        </w:trPr>
         <w:tc>
           <w:tcPr>
-            <w:tcW w:type="dxa" w:w="1681"/>
+            <w:tcW w:type="dxa" w:w="397"/>
+            <w:vAlign w:val="center"/>
+            <w:shd w:fill="F2F5F9"/>
           </w:tcPr>
           <w:p>
             <w:pPr>
-              <w:spacing w:after="20"/>
+              <w:spacing w:after="20" w:before="20"/>
             </w:pPr>
             <w:r>
               <w:rPr>
-                <w:sz w:val="16"/>
-              </w:rPr>
-              <w:t>2 200</w:t>
-            </w:r>
-          </w:p>
-        </w:tc>
-      </w:tr>
-      <w:tr>
-        <w:tc>
-          <w:tcPr>
-            <w:tcW w:type="dxa" w:w="1681"/>
-          </w:tcPr>
-          <w:p>
-            <w:pPr>
-              <w:spacing w:after="20"/>
-            </w:pPr>
-            <w:r>
-              <w:rPr>
-                <w:sz w:val="16"/>
-              </w:rPr>
-              <w:t>225</w:t>
-            </w:r>
-          </w:p>
-        </w:tc>
-        <w:tc>
-          <w:tcPr>
-            <w:tcW w:type="dxa" w:w="1681"/>
-          </w:tcPr>
-          <w:p>
-            <w:pPr>
-              <w:spacing w:after="20"/>
-            </w:pPr>
-            <w:r>
-              <w:rPr>
-                <w:sz w:val="16"/>
-              </w:rPr>
-              <w:t>Trevo-branco</w:t>
-            </w:r>
-          </w:p>
-        </w:tc>
-        <w:tc>
-          <w:tcPr>
-            <w:tcW w:type="dxa" w:w="1681"/>
-          </w:tcPr>
-          <w:p>
-            <w:pPr>
-              <w:spacing w:after="20"/>
-            </w:pPr>
-            <w:r>
-              <w:rPr>
-                <w:sz w:val="16"/>
-              </w:rPr>
-              <w:t>1 760</w:t>
-            </w:r>
-          </w:p>
-        </w:tc>
-        <w:tc>
-          <w:tcPr>
-            <w:tcW w:type="dxa" w:w="1681"/>
-          </w:tcPr>
-          <w:p>
-            <w:pPr>
-              <w:spacing w:after="20"/>
-            </w:pPr>
-            <w:r>
-              <w:rPr>
-                <w:sz w:val="16"/>
-              </w:rPr>
-              <w:t>220</w:t>
-            </w:r>
-          </w:p>
-        </w:tc>
-        <w:tc>
-          <w:tcPr>
-            <w:tcW w:type="dxa" w:w="1681"/>
-          </w:tcPr>
-          <w:p>
-            <w:pPr>
-              <w:spacing w:after="20"/>
-            </w:pPr>
-            <w:r>
-              <w:rPr>
-                <w:sz w:val="16"/>
-              </w:rPr>
-              <w:t>220</w:t>
-            </w:r>
-          </w:p>
-        </w:tc>
-        <w:tc>
-          <w:tcPr>
-            <w:tcW w:type="dxa" w:w="1681"/>
-          </w:tcPr>
-          <w:p>
-            <w:pPr>
-              <w:spacing w:after="20"/>
-            </w:pPr>
-            <w:r>
-              <w:rPr>
-                <w:sz w:val="16"/>
-              </w:rPr>
-              <w:t>2 200</w:t>
-            </w:r>
-          </w:p>
-        </w:tc>
-      </w:tr>
-      <w:tr>
-        <w:tc>
-          <w:tcPr>
-            <w:tcW w:type="dxa" w:w="1681"/>
-          </w:tcPr>
-          <w:p>
-            <w:pPr>
-              <w:spacing w:after="20"/>
-            </w:pPr>
-            <w:r>
-              <w:rPr>
-                <w:sz w:val="16"/>
-              </w:rPr>
-              <w:t>237</w:t>
-            </w:r>
-          </w:p>
-        </w:tc>
-        <w:tc>
-          <w:tcPr>
-            <w:tcW w:type="dxa" w:w="1681"/>
-          </w:tcPr>
-          <w:p>
-            <w:pPr>
-              <w:spacing w:after="20"/>
-            </w:pPr>
-            <w:r>
-              <w:rPr>
-                <w:sz w:val="16"/>
-              </w:rPr>
-              <w:t>Morangueiro silvestre</w:t>
-            </w:r>
-          </w:p>
-        </w:tc>
-        <w:tc>
-          <w:tcPr>
-            <w:tcW w:type="dxa" w:w="1681"/>
-          </w:tcPr>
-          <w:p>
-            <w:pPr>
-              <w:spacing w:after="20"/>
-            </w:pPr>
-            <w:r>
-              <w:rPr>
-                <w:sz w:val="16"/>
-              </w:rPr>
-              <w:t>1 760</w:t>
-            </w:r>
-          </w:p>
-        </w:tc>
-        <w:tc>
-          <w:tcPr>
-            <w:tcW w:type="dxa" w:w="1681"/>
-          </w:tcPr>
-          <w:p>
-            <w:pPr>
-              <w:spacing w:after="20"/>
-            </w:pPr>
-            <w:r>
-              <w:rPr>
-                <w:sz w:val="16"/>
-              </w:rPr>
-              <w:t>220</w:t>
-            </w:r>
-          </w:p>
-        </w:tc>
-        <w:tc>
-          <w:tcPr>
-            <w:tcW w:type="dxa" w:w="1681"/>
-          </w:tcPr>
-          <w:p>
-            <w:pPr>
-              <w:spacing w:after="20"/>
-            </w:pPr>
-            <w:r>
-              <w:rPr>
-                <w:sz w:val="16"/>
-              </w:rPr>
-              <w:t>220</w:t>
-            </w:r>
-          </w:p>
-        </w:tc>
-        <w:tc>
-          <w:tcPr>
-            <w:tcW w:type="dxa" w:w="1681"/>
-          </w:tcPr>
-          <w:p>
-            <w:pPr>
-              <w:spacing w:after="20"/>
-            </w:pPr>
-            <w:r>
-              <w:rPr>
-                <w:sz w:val="16"/>
-              </w:rPr>
-              <w:t>2 200</w:t>
-            </w:r>
-          </w:p>
-        </w:tc>
-      </w:tr>
-      <w:tr>
-        <w:tc>
-          <w:tcPr>
-            <w:tcW w:type="dxa" w:w="1681"/>
-          </w:tcPr>
-          <w:p>
-            <w:pPr>
-              <w:spacing w:after="20"/>
-            </w:pPr>
-            <w:r>
-              <w:rPr>
-                <w:sz w:val="16"/>
+                <w:sz w:val="15"/>
               </w:rPr>
               <w:t>—</w:t>
             </w:r>
@@ -737,15 +927,17 @@
         </w:tc>
         <w:tc>
           <w:tcPr>
-            <w:tcW w:type="dxa" w:w="1681"/>
+            <w:tcW w:type="dxa" w:w="1417"/>
+            <w:vAlign w:val="center"/>
+            <w:shd w:fill="F2F5F9"/>
           </w:tcPr>
           <w:p>
             <w:pPr>
-              <w:spacing w:after="20"/>
+              <w:spacing w:after="20" w:before="20"/>
             </w:pPr>
             <w:r>
               <w:rPr>
-                <w:sz w:val="16"/>
+                <w:sz w:val="15"/>
               </w:rPr>
               <w:t>Total</w:t>
             </w:r>
@@ -753,15 +945,52 @@
         </w:tc>
         <w:tc>
           <w:tcPr>
-            <w:tcW w:type="dxa" w:w="1681"/>
+            <w:tcW w:type="dxa" w:w="2041"/>
+            <w:vAlign w:val="center"/>
+            <w:shd w:fill="F2F5F9"/>
           </w:tcPr>
           <w:p>
             <w:pPr>
-              <w:spacing w:after="20"/>
+              <w:spacing w:after="20" w:before="20"/>
             </w:pPr>
             <w:r>
               <w:rPr>
-                <w:sz w:val="16"/>
+                <w:sz w:val="15"/>
+              </w:rPr>
+              <w:t>5 espécies</w:t>
+            </w:r>
+          </w:p>
+        </w:tc>
+        <w:tc>
+          <w:tcPr>
+            <w:tcW w:type="dxa" w:w="1417"/>
+            <w:vAlign w:val="center"/>
+            <w:shd w:fill="F2F5F9"/>
+          </w:tcPr>
+          <w:p>
+            <w:pPr>
+              <w:spacing w:after="20" w:before="20"/>
+            </w:pPr>
+            <w:r>
+              <w:rPr>
+                <w:sz w:val="15"/>
+              </w:rPr>
+            </w:r>
+          </w:p>
+        </w:tc>
+        <w:tc>
+          <w:tcPr>
+            <w:tcW w:type="dxa" w:w="680"/>
+            <w:vAlign w:val="center"/>
+            <w:shd w:fill="F2F5F9"/>
+          </w:tcPr>
+          <w:p>
+            <w:pPr>
+              <w:spacing w:after="20" w:before="20"/>
+            </w:pPr>
+            <w:r>
+              <w:rPr>
+                <w:sz w:val="15"/>
               </w:rPr>
               <w:t>8 800</w:t>
             </w:r>
@@ -769,15 +998,17 @@
         </w:tc>
         <w:tc>
           <w:tcPr>
-            <w:tcW w:type="dxa" w:w="1681"/>
+            <w:tcW w:type="dxa" w:w="567"/>
+            <w:vAlign w:val="center"/>
+            <w:shd w:fill="F2F5F9"/>
           </w:tcPr>
           <w:p>
             <w:pPr>
-              <w:spacing w:after="20"/>
+              <w:spacing w:after="20" w:before="20"/>
             </w:pPr>
             <w:r>
               <w:rPr>
-                <w:sz w:val="16"/>
+                <w:sz w:val="15"/>
               </w:rPr>
               <w:t>1 100</w:t>
             </w:r>
@@ -785,33 +1016,19 @@
         </w:tc>
         <w:tc>
           <w:tcPr>
-            <w:tcW w:type="dxa" w:w="1681"/>
+            <w:tcW w:type="dxa" w:w="567"/>
+            <w:vAlign w:val="center"/>
+            <w:shd w:fill="F2F5F9"/>
           </w:tcPr>
           <w:p>
             <w:pPr>
-              <w:spacing w:after="20"/>
+              <w:spacing w:after="20" w:before="20"/>
             </w:pPr>
             <w:r>
               <w:rPr>
-                <w:sz w:val="16"/>
+                <w:sz w:val="15"/>
               </w:rPr>
               <w:t>1 100</w:t>
-            </w:r>
-          </w:p>
-        </w:tc>
-        <w:tc>
-          <w:tcPr>
-            <w:tcW w:type="dxa" w:w="1681"/>
-          </w:tcPr>
-          <w:p>
-            <w:pPr>
-              <w:spacing w:after="20"/>
-            </w:pPr>
-            <w:r>
-              <w:rPr>
-                <w:sz w:val="16"/>
-              </w:rPr>
-              <w:t>11 000</w:t>
             </w:r>
           </w:p>
         </w:tc>
@@ -824,12 +1041,17 @@
     </w:p>
     <w:p>
       <w:r>
-        <w:t>A seleção incluiu as etiquetas de órgão flower, leaf, fruit e habit: 6 974 flores, 3 416 folhas, 505 frutos e 105 plantas inteiras. Excluíram-se bark, branch e other. O manifesto selecao_imagens.csv regista os caminhos, a classe, a partição, o órgão, o autor e a licença de cada fotografia. Os 11 000 identificadores de imagem são únicos e não há identificadores de observação repetidos entre partições. A verificação local confirmou os 11 000 ficheiros, sem ausências ou ficheiros ilegíveis. A leitura técnica não garante que todos os rótulos estejam corretos.</w:t>
+        <w:t>O morangueiro cultivado (ID 641) foi substituído pelo morangueiro silvestre (ID 237), pois o primeiro tinha apenas 343 imagens no conjunto original. O manifesto selecao_imagens.csv identifica exatamente as 11 000 fotografias selecionadas com semente 42: 2 200 por classe e uma divisão de 80%/10%/10%. Foram preservadas as partições oficiais; não se repetem identificadores de imagem nem de observação entre os três conjuntos.</w:t>
       </w:r>
     </w:p>
     <w:p>
       <w:r>
-        <w:t>As imagens originais têm dimensões variáveis. No carregamento, são redimensionadas para 128 × 128 píxeis RGB: 49 152 valores por imagem, divididos por 255 no modelo. Não houve uma etapa separada de extração manual de características. O subconjunto de cinco classes não é um benchmark publicado; resultados de sistemas treinados nas 1 000 classes de origem não são diretamente comparáveis. O estado de referência específico deste subconjunto é a comparação interna entre MLP e CNN aqui apresentada.</w:t>
+        <w:t>A seleção inclui 6 974 fotografias etiquetadas como flor, 3 416 como folha, 505 como fruto e 105 como planta inteira; exclui as etiquetas casca, ramo e outro. O manifesto regista ainda autor e licença. A verificação local encontrou os 11 000 ficheiros e nenhum ilegível. Esta verificação técnica não prova que todos os rótulos botânicos estejam corretos.</w:t>
+      </w:r>
+    </w:p>
+    <w:p>
+      <w:r>
+        <w:br w:type="page"/>
       </w:r>
     </w:p>
     <w:p>
@@ -845,75 +1067,118 @@
         <w:pStyle w:val="Heading2"/>
       </w:pPr>
       <w:r>
-        <w:t>2.1 Implementação e arquiteturas</w:t>
+        <w:t>2.1. Preparação e configuração comum</w:t>
       </w:r>
     </w:p>
     <w:p>
       <w:r>
-        <w:t>A implementação usa Python 3.12 e TensorFlow/Keras. As pastas dataset/train, dataset/val e dataset/test são lidas pela ordem fixa dos IDs 0008, 0172, 0200, 0225 e 0237. Apenas treino e validação entram na escolha da arquitetura. O teste de 1 100 imagens é usado depois dessa decisão. Os dois modelos iniciais usam batch de 32, 10 épocas, Adam com taxa de aprendizagem 0,001, perda sparse categorical crossentropy e semente 42.</w:t>
+        <w:t>Os scripts usam Python 3.12 e TensorFlow/Keras. As imagens são lidas de dataset/train, dataset/val e dataset/test, com a ordem fixa dos IDs 0008, 0172, 0200, 0225 e 0237. No carregamento, cada fotografia é redimensionada para RGB 128 × 128, isto é, 49 152 valores. A camada Rescaling divide os píxeis por 255. O treino é baralhado com semente 42; validação e teste mantêm ordem fixa. Não houve extração manual de características. A MLP e a CNN iniciais usam as mesmas imagens, batch de 32, Adam com taxa 0,001, perda sparse categorical crossentropy e 10 épocas.</w:t>
+      </w:r>
+    </w:p>
+    <w:p>
+      <w:pPr>
+        <w:pStyle w:val="Heading2"/>
+      </w:pPr>
+      <w:r>
+        <w:t>2.2. Modelo alternativo: MLP</w:t>
+      </w:r>
+    </w:p>
+    <w:p>
+      <w:r>
+        <w:t>A MLP transforma a imagem num vetor antes de a classificar. A Tabela 2 segue as camadas efetivamente definidas em treinar.py; os parâmetros foram conferidos pela dimensão de entrada e pelo número de neurónios.</w:t>
       </w:r>
     </w:p>
     <w:tbl>
       <w:tblPr>
-        <w:tblStyle w:val="LightShading-Accent1"/>
         <w:tblW w:type="auto" w:w="0"/>
         <w:jc w:val="center"/>
+        <w:tblLayout w:type="fixed"/>
         <w:tblLook w:firstColumn="1" w:firstRow="1" w:lastColumn="0" w:lastRow="0" w:noHBand="0" w:noVBand="1" w:val="04A0"/>
       </w:tblPr>
       <w:tblGrid>
-        <w:gridCol w:w="3362"/>
-        <w:gridCol w:w="3362"/>
-        <w:gridCol w:w="3362"/>
+        <w:gridCol w:w="2466"/>
+        <w:gridCol w:w="2466"/>
+        <w:gridCol w:w="2466"/>
+        <w:gridCol w:w="2466"/>
       </w:tblGrid>
       <w:tr>
+        <w:trPr>
+          <w:cantSplit/>
+        </w:trPr>
         <w:tc>
           <w:tcPr>
-            <w:tcW w:type="dxa" w:w="3362"/>
+            <w:tcW w:type="dxa" w:w="1417"/>
+            <w:vAlign w:val="center"/>
+            <w:shd w:fill="DCE5F2"/>
           </w:tcPr>
           <w:p>
             <w:pPr>
-              <w:spacing w:after="20"/>
+              <w:spacing w:after="20" w:before="20"/>
             </w:pPr>
             <w:r>
               <w:rPr>
                 <w:b/>
-                <w:color w:val="1D6147"/>
+                <w:color w:val="2D4571"/>
                 <w:sz w:val="16"/>
               </w:rPr>
-              <w:t>Solução</w:t>
+              <w:t>Camada</w:t>
             </w:r>
           </w:p>
         </w:tc>
         <w:tc>
           <w:tcPr>
-            <w:tcW w:type="dxa" w:w="3362"/>
+            <w:tcW w:type="dxa" w:w="3061"/>
+            <w:vAlign w:val="center"/>
+            <w:shd w:fill="DCE5F2"/>
           </w:tcPr>
           <w:p>
             <w:pPr>
-              <w:spacing w:after="20"/>
+              <w:spacing w:after="20" w:before="20"/>
             </w:pPr>
             <w:r>
               <w:rPr>
                 <w:b/>
-                <w:color w:val="1D6147"/>
+                <w:color w:val="2D4571"/>
                 <w:sz w:val="16"/>
               </w:rPr>
-              <w:t>Camadas após entrada RGB 128×128</w:t>
+              <w:t>Configuração</w:t>
             </w:r>
           </w:p>
         </w:tc>
         <w:tc>
           <w:tcPr>
-            <w:tcW w:type="dxa" w:w="3362"/>
+            <w:tcW w:type="dxa" w:w="1701"/>
+            <w:vAlign w:val="center"/>
+            <w:shd w:fill="DCE5F2"/>
           </w:tcPr>
           <w:p>
             <w:pPr>
-              <w:spacing w:after="20"/>
+              <w:spacing w:after="20" w:before="20"/>
             </w:pPr>
             <w:r>
               <w:rPr>
                 <w:b/>
-                <w:color w:val="1D6147"/>
+                <w:color w:val="2D4571"/>
+                <w:sz w:val="16"/>
+              </w:rPr>
+              <w:t>Saída</w:t>
+            </w:r>
+          </w:p>
+        </w:tc>
+        <w:tc>
+          <w:tcPr>
+            <w:tcW w:type="dxa" w:w="1304"/>
+            <w:vAlign w:val="center"/>
+            <w:shd w:fill="DCE5F2"/>
+          </w:tcPr>
+          <w:p>
+            <w:pPr>
+              <w:spacing w:after="20" w:before="20"/>
+            </w:pPr>
+            <w:r>
+              <w:rPr>
+                <w:b/>
+                <w:color w:val="2D4571"/>
                 <w:sz w:val="16"/>
               </w:rPr>
               <w:t>Parâmetros</w:t>
@@ -922,45 +1187,443 @@
         </w:tc>
       </w:tr>
       <w:tr>
+        <w:trPr>
+          <w:cantSplit/>
+        </w:trPr>
         <w:tc>
           <w:tcPr>
-            <w:tcW w:type="dxa" w:w="3362"/>
+            <w:tcW w:type="dxa" w:w="1417"/>
+            <w:vAlign w:val="center"/>
           </w:tcPr>
           <w:p>
             <w:pPr>
-              <w:spacing w:after="20"/>
+              <w:spacing w:after="20" w:before="20"/>
             </w:pPr>
             <w:r>
               <w:rPr>
                 <w:sz w:val="16"/>
               </w:rPr>
-              <w:t>MLP</w:t>
+              <w:t>Entrada</w:t>
             </w:r>
           </w:p>
         </w:tc>
         <w:tc>
           <w:tcPr>
-            <w:tcW w:type="dxa" w:w="3362"/>
+            <w:tcW w:type="dxa" w:w="3061"/>
+            <w:vAlign w:val="center"/>
           </w:tcPr>
           <w:p>
             <w:pPr>
-              <w:spacing w:after="20"/>
+              <w:spacing w:after="20" w:before="20"/>
             </w:pPr>
             <w:r>
               <w:rPr>
                 <w:sz w:val="16"/>
               </w:rPr>
-              <w:t>Rescaling; Flatten; Dense 64 (ReLU); Dense 5 (softmax)</w:t>
+              <w:t>RGB</w:t>
             </w:r>
           </w:p>
         </w:tc>
         <w:tc>
           <w:tcPr>
-            <w:tcW w:type="dxa" w:w="3362"/>
+            <w:tcW w:type="dxa" w:w="1701"/>
+            <w:vAlign w:val="center"/>
           </w:tcPr>
           <w:p>
             <w:pPr>
-              <w:spacing w:after="20"/>
+              <w:spacing w:after="20" w:before="20"/>
+            </w:pPr>
+            <w:r>
+              <w:rPr>
+                <w:sz w:val="16"/>
+              </w:rPr>
+              <w:t>128 × 128 × 3</w:t>
+            </w:r>
+          </w:p>
+        </w:tc>
+        <w:tc>
+          <w:tcPr>
+            <w:tcW w:type="dxa" w:w="1304"/>
+            <w:vAlign w:val="center"/>
+          </w:tcPr>
+          <w:p>
+            <w:pPr>
+              <w:spacing w:after="20" w:before="20"/>
+            </w:pPr>
+            <w:r>
+              <w:rPr>
+                <w:sz w:val="16"/>
+              </w:rPr>
+              <w:t>0</w:t>
+            </w:r>
+          </w:p>
+        </w:tc>
+      </w:tr>
+      <w:tr>
+        <w:trPr>
+          <w:cantSplit/>
+        </w:trPr>
+        <w:tc>
+          <w:tcPr>
+            <w:tcW w:type="dxa" w:w="1417"/>
+            <w:vAlign w:val="center"/>
+            <w:shd w:fill="F2F5F9"/>
+          </w:tcPr>
+          <w:p>
+            <w:pPr>
+              <w:spacing w:after="20" w:before="20"/>
+            </w:pPr>
+            <w:r>
+              <w:rPr>
+                <w:sz w:val="16"/>
+              </w:rPr>
+              <w:t>Rescaling</w:t>
+            </w:r>
+          </w:p>
+        </w:tc>
+        <w:tc>
+          <w:tcPr>
+            <w:tcW w:type="dxa" w:w="3061"/>
+            <w:vAlign w:val="center"/>
+            <w:shd w:fill="F2F5F9"/>
+          </w:tcPr>
+          <w:p>
+            <w:pPr>
+              <w:spacing w:after="20" w:before="20"/>
+            </w:pPr>
+            <w:r>
+              <w:rPr>
+                <w:sz w:val="16"/>
+              </w:rPr>
+              <w:t>píxeis / 255</w:t>
+            </w:r>
+          </w:p>
+        </w:tc>
+        <w:tc>
+          <w:tcPr>
+            <w:tcW w:type="dxa" w:w="1701"/>
+            <w:vAlign w:val="center"/>
+            <w:shd w:fill="F2F5F9"/>
+          </w:tcPr>
+          <w:p>
+            <w:pPr>
+              <w:spacing w:after="20" w:before="20"/>
+            </w:pPr>
+            <w:r>
+              <w:rPr>
+                <w:sz w:val="16"/>
+              </w:rPr>
+              <w:t>128 × 128 × 3</w:t>
+            </w:r>
+          </w:p>
+        </w:tc>
+        <w:tc>
+          <w:tcPr>
+            <w:tcW w:type="dxa" w:w="1304"/>
+            <w:vAlign w:val="center"/>
+            <w:shd w:fill="F2F5F9"/>
+          </w:tcPr>
+          <w:p>
+            <w:pPr>
+              <w:spacing w:after="20" w:before="20"/>
+            </w:pPr>
+            <w:r>
+              <w:rPr>
+                <w:sz w:val="16"/>
+              </w:rPr>
+              <w:t>0</w:t>
+            </w:r>
+          </w:p>
+        </w:tc>
+      </w:tr>
+      <w:tr>
+        <w:trPr>
+          <w:cantSplit/>
+        </w:trPr>
+        <w:tc>
+          <w:tcPr>
+            <w:tcW w:type="dxa" w:w="1417"/>
+            <w:vAlign w:val="center"/>
+          </w:tcPr>
+          <w:p>
+            <w:pPr>
+              <w:spacing w:after="20" w:before="20"/>
+            </w:pPr>
+            <w:r>
+              <w:rPr>
+                <w:sz w:val="16"/>
+              </w:rPr>
+              <w:t>Flatten</w:t>
+            </w:r>
+          </w:p>
+        </w:tc>
+        <w:tc>
+          <w:tcPr>
+            <w:tcW w:type="dxa" w:w="3061"/>
+            <w:vAlign w:val="center"/>
+          </w:tcPr>
+          <w:p>
+            <w:pPr>
+              <w:spacing w:after="20" w:before="20"/>
+            </w:pPr>
+            <w:r>
+              <w:rPr>
+                <w:sz w:val="16"/>
+              </w:rPr>
+              <w:t>achatamento</w:t>
+            </w:r>
+          </w:p>
+        </w:tc>
+        <w:tc>
+          <w:tcPr>
+            <w:tcW w:type="dxa" w:w="1701"/>
+            <w:vAlign w:val="center"/>
+          </w:tcPr>
+          <w:p>
+            <w:pPr>
+              <w:spacing w:after="20" w:before="20"/>
+            </w:pPr>
+            <w:r>
+              <w:rPr>
+                <w:sz w:val="16"/>
+              </w:rPr>
+              <w:t>49 152</w:t>
+            </w:r>
+          </w:p>
+        </w:tc>
+        <w:tc>
+          <w:tcPr>
+            <w:tcW w:type="dxa" w:w="1304"/>
+            <w:vAlign w:val="center"/>
+          </w:tcPr>
+          <w:p>
+            <w:pPr>
+              <w:spacing w:after="20" w:before="20"/>
+            </w:pPr>
+            <w:r>
+              <w:rPr>
+                <w:sz w:val="16"/>
+              </w:rPr>
+              <w:t>0</w:t>
+            </w:r>
+          </w:p>
+        </w:tc>
+      </w:tr>
+      <w:tr>
+        <w:trPr>
+          <w:cantSplit/>
+        </w:trPr>
+        <w:tc>
+          <w:tcPr>
+            <w:tcW w:type="dxa" w:w="1417"/>
+            <w:vAlign w:val="center"/>
+            <w:shd w:fill="F2F5F9"/>
+          </w:tcPr>
+          <w:p>
+            <w:pPr>
+              <w:spacing w:after="20" w:before="20"/>
+            </w:pPr>
+            <w:r>
+              <w:rPr>
+                <w:sz w:val="16"/>
+              </w:rPr>
+              <w:t>Dense</w:t>
+            </w:r>
+          </w:p>
+        </w:tc>
+        <w:tc>
+          <w:tcPr>
+            <w:tcW w:type="dxa" w:w="3061"/>
+            <w:vAlign w:val="center"/>
+            <w:shd w:fill="F2F5F9"/>
+          </w:tcPr>
+          <w:p>
+            <w:pPr>
+              <w:spacing w:after="20" w:before="20"/>
+            </w:pPr>
+            <w:r>
+              <w:rPr>
+                <w:sz w:val="16"/>
+              </w:rPr>
+              <w:t>64 neurónios; ReLU</w:t>
+            </w:r>
+          </w:p>
+        </w:tc>
+        <w:tc>
+          <w:tcPr>
+            <w:tcW w:type="dxa" w:w="1701"/>
+            <w:vAlign w:val="center"/>
+            <w:shd w:fill="F2F5F9"/>
+          </w:tcPr>
+          <w:p>
+            <w:pPr>
+              <w:spacing w:after="20" w:before="20"/>
+            </w:pPr>
+            <w:r>
+              <w:rPr>
+                <w:sz w:val="16"/>
+              </w:rPr>
+              <w:t>64</w:t>
+            </w:r>
+          </w:p>
+        </w:tc>
+        <w:tc>
+          <w:tcPr>
+            <w:tcW w:type="dxa" w:w="1304"/>
+            <w:vAlign w:val="center"/>
+            <w:shd w:fill="F2F5F9"/>
+          </w:tcPr>
+          <w:p>
+            <w:pPr>
+              <w:spacing w:after="20" w:before="20"/>
+            </w:pPr>
+            <w:r>
+              <w:rPr>
+                <w:sz w:val="16"/>
+              </w:rPr>
+              <w:t>3 145 792</w:t>
+            </w:r>
+          </w:p>
+        </w:tc>
+      </w:tr>
+      <w:tr>
+        <w:trPr>
+          <w:cantSplit/>
+        </w:trPr>
+        <w:tc>
+          <w:tcPr>
+            <w:tcW w:type="dxa" w:w="1417"/>
+            <w:vAlign w:val="center"/>
+          </w:tcPr>
+          <w:p>
+            <w:pPr>
+              <w:spacing w:after="20" w:before="20"/>
+            </w:pPr>
+            <w:r>
+              <w:rPr>
+                <w:sz w:val="16"/>
+              </w:rPr>
+              <w:t>Dense</w:t>
+            </w:r>
+          </w:p>
+        </w:tc>
+        <w:tc>
+          <w:tcPr>
+            <w:tcW w:type="dxa" w:w="3061"/>
+            <w:vAlign w:val="center"/>
+          </w:tcPr>
+          <w:p>
+            <w:pPr>
+              <w:spacing w:after="20" w:before="20"/>
+            </w:pPr>
+            <w:r>
+              <w:rPr>
+                <w:sz w:val="16"/>
+              </w:rPr>
+              <w:t>5 neurónios; softmax</w:t>
+            </w:r>
+          </w:p>
+        </w:tc>
+        <w:tc>
+          <w:tcPr>
+            <w:tcW w:type="dxa" w:w="1701"/>
+            <w:vAlign w:val="center"/>
+          </w:tcPr>
+          <w:p>
+            <w:pPr>
+              <w:spacing w:after="20" w:before="20"/>
+            </w:pPr>
+            <w:r>
+              <w:rPr>
+                <w:sz w:val="16"/>
+              </w:rPr>
+              <w:t>5</w:t>
+            </w:r>
+          </w:p>
+        </w:tc>
+        <w:tc>
+          <w:tcPr>
+            <w:tcW w:type="dxa" w:w="1304"/>
+            <w:vAlign w:val="center"/>
+          </w:tcPr>
+          <w:p>
+            <w:pPr>
+              <w:spacing w:after="20" w:before="20"/>
+            </w:pPr>
+            <w:r>
+              <w:rPr>
+                <w:sz w:val="16"/>
+              </w:rPr>
+              <w:t>325</w:t>
+            </w:r>
+          </w:p>
+        </w:tc>
+      </w:tr>
+      <w:tr>
+        <w:trPr>
+          <w:cantSplit/>
+        </w:trPr>
+        <w:tc>
+          <w:tcPr>
+            <w:tcW w:type="dxa" w:w="1417"/>
+            <w:vAlign w:val="center"/>
+            <w:shd w:fill="F2F5F9"/>
+          </w:tcPr>
+          <w:p>
+            <w:pPr>
+              <w:spacing w:after="20" w:before="20"/>
+            </w:pPr>
+            <w:r>
+              <w:rPr>
+                <w:sz w:val="16"/>
+              </w:rPr>
+              <w:t>Total</w:t>
+            </w:r>
+          </w:p>
+        </w:tc>
+        <w:tc>
+          <w:tcPr>
+            <w:tcW w:type="dxa" w:w="3061"/>
+            <w:vAlign w:val="center"/>
+            <w:shd w:fill="F2F5F9"/>
+          </w:tcPr>
+          <w:p>
+            <w:pPr>
+              <w:spacing w:after="20" w:before="20"/>
+            </w:pPr>
+            <w:r>
+              <w:rPr>
+                <w:sz w:val="16"/>
+              </w:rPr>
+            </w:r>
+          </w:p>
+        </w:tc>
+        <w:tc>
+          <w:tcPr>
+            <w:tcW w:type="dxa" w:w="1701"/>
+            <w:vAlign w:val="center"/>
+            <w:shd w:fill="F2F5F9"/>
+          </w:tcPr>
+          <w:p>
+            <w:pPr>
+              <w:spacing w:after="20" w:before="20"/>
+            </w:pPr>
+            <w:r>
+              <w:rPr>
+                <w:sz w:val="16"/>
+              </w:rPr>
+            </w:r>
+          </w:p>
+        </w:tc>
+        <w:tc>
+          <w:tcPr>
+            <w:tcW w:type="dxa" w:w="1304"/>
+            <w:vAlign w:val="center"/>
+            <w:shd w:fill="F2F5F9"/>
+          </w:tcPr>
+          <w:p>
+            <w:pPr>
+              <w:spacing w:after="20" w:before="20"/>
             </w:pPr>
             <w:r>
               <w:rPr>
@@ -971,46 +1634,939 @@
           </w:p>
         </w:tc>
       </w:tr>
+    </w:tbl>
+    <w:p>
+      <w:pPr>
+        <w:spacing w:after="0"/>
+      </w:pPr>
+    </w:p>
+    <w:p>
+      <w:r>
+        <w:t>A maioria dos parâmetros está na ligação entre os 49 152 valores e os 64 neurónios. A MLP aprende com os píxeis, mas a arquitetura não explora diretamente a proximidade espacial entre eles.</w:t>
+      </w:r>
+    </w:p>
+    <w:p>
+      <w:pPr>
+        <w:pStyle w:val="Heading2"/>
+      </w:pPr>
+      <w:r>
+        <w:t>2.3. Modelo escolhido: CNN com dropout</w:t>
+      </w:r>
+    </w:p>
+    <w:p>
+      <w:r>
+        <w:t>A CNN aplica filtros locais e reduz progressivamente as dimensões espaciais. A primeira versão, em treinar.py, não tem dropout. Após comparar as variações, foi escolhida a versão de treinar_variacoes.py descrita na Tabela 3: conserva as mesmas convoluções e acrescenta dropout de 0,5 antes da saída.</w:t>
+      </w:r>
+    </w:p>
+    <w:tbl>
+      <w:tblPr>
+        <w:tblW w:type="auto" w:w="0"/>
+        <w:jc w:val="center"/>
+        <w:tblLayout w:type="fixed"/>
+        <w:tblLook w:firstColumn="1" w:firstRow="1" w:lastColumn="0" w:lastRow="0" w:noHBand="0" w:noVBand="1" w:val="04A0"/>
+      </w:tblPr>
+      <w:tblGrid>
+        <w:gridCol w:w="2466"/>
+        <w:gridCol w:w="2466"/>
+        <w:gridCol w:w="2466"/>
+        <w:gridCol w:w="2466"/>
+      </w:tblGrid>
       <w:tr>
+        <w:trPr>
+          <w:cantSplit/>
+        </w:trPr>
         <w:tc>
           <w:tcPr>
-            <w:tcW w:type="dxa" w:w="3362"/>
+            <w:tcW w:type="dxa" w:w="1417"/>
+            <w:vAlign w:val="center"/>
+            <w:shd w:fill="DCE5F2"/>
           </w:tcPr>
           <w:p>
             <w:pPr>
-              <w:spacing w:after="20"/>
+              <w:spacing w:after="20" w:before="20"/>
+            </w:pPr>
+            <w:r>
+              <w:rPr>
+                <w:b/>
+                <w:color w:val="2D4571"/>
+                <w:sz w:val="16"/>
+              </w:rPr>
+              <w:t>Camada</w:t>
+            </w:r>
+          </w:p>
+        </w:tc>
+        <w:tc>
+          <w:tcPr>
+            <w:tcW w:type="dxa" w:w="3061"/>
+            <w:vAlign w:val="center"/>
+            <w:shd w:fill="DCE5F2"/>
+          </w:tcPr>
+          <w:p>
+            <w:pPr>
+              <w:spacing w:after="20" w:before="20"/>
+            </w:pPr>
+            <w:r>
+              <w:rPr>
+                <w:b/>
+                <w:color w:val="2D4571"/>
+                <w:sz w:val="16"/>
+              </w:rPr>
+              <w:t>Configuração</w:t>
+            </w:r>
+          </w:p>
+        </w:tc>
+        <w:tc>
+          <w:tcPr>
+            <w:tcW w:type="dxa" w:w="1701"/>
+            <w:vAlign w:val="center"/>
+            <w:shd w:fill="DCE5F2"/>
+          </w:tcPr>
+          <w:p>
+            <w:pPr>
+              <w:spacing w:after="20" w:before="20"/>
+            </w:pPr>
+            <w:r>
+              <w:rPr>
+                <w:b/>
+                <w:color w:val="2D4571"/>
+                <w:sz w:val="16"/>
+              </w:rPr>
+              <w:t>Saída</w:t>
+            </w:r>
+          </w:p>
+        </w:tc>
+        <w:tc>
+          <w:tcPr>
+            <w:tcW w:type="dxa" w:w="1304"/>
+            <w:vAlign w:val="center"/>
+            <w:shd w:fill="DCE5F2"/>
+          </w:tcPr>
+          <w:p>
+            <w:pPr>
+              <w:spacing w:after="20" w:before="20"/>
+            </w:pPr>
+            <w:r>
+              <w:rPr>
+                <w:b/>
+                <w:color w:val="2D4571"/>
+                <w:sz w:val="16"/>
+              </w:rPr>
+              <w:t>Parâmetros</w:t>
+            </w:r>
+          </w:p>
+        </w:tc>
+      </w:tr>
+      <w:tr>
+        <w:trPr>
+          <w:cantSplit/>
+        </w:trPr>
+        <w:tc>
+          <w:tcPr>
+            <w:tcW w:type="dxa" w:w="1417"/>
+            <w:vAlign w:val="center"/>
+          </w:tcPr>
+          <w:p>
+            <w:pPr>
+              <w:spacing w:after="20" w:before="20"/>
             </w:pPr>
             <w:r>
               <w:rPr>
                 <w:sz w:val="16"/>
               </w:rPr>
-              <w:t>CNN</w:t>
+              <w:t>Entrada</w:t>
             </w:r>
           </w:p>
         </w:tc>
         <w:tc>
           <w:tcPr>
-            <w:tcW w:type="dxa" w:w="3362"/>
+            <w:tcW w:type="dxa" w:w="3061"/>
+            <w:vAlign w:val="center"/>
           </w:tcPr>
           <w:p>
             <w:pPr>
-              <w:spacing w:after="20"/>
+              <w:spacing w:after="20" w:before="20"/>
             </w:pPr>
             <w:r>
               <w:rPr>
                 <w:sz w:val="16"/>
               </w:rPr>
-              <w:t>Rescaling; Conv 16 (3×3, ReLU); MaxPool 2×2; Conv 32 (3×3, ReLU); MaxPool 2×2; Flatten; Dense 64 (ReLU); Dense 5 (softmax)</w:t>
+              <w:t>RGB</w:t>
             </w:r>
           </w:p>
         </w:tc>
         <w:tc>
           <w:tcPr>
-            <w:tcW w:type="dxa" w:w="3362"/>
+            <w:tcW w:type="dxa" w:w="1701"/>
+            <w:vAlign w:val="center"/>
           </w:tcPr>
           <w:p>
             <w:pPr>
-              <w:spacing w:after="20"/>
+              <w:spacing w:after="20" w:before="20"/>
+            </w:pPr>
+            <w:r>
+              <w:rPr>
+                <w:sz w:val="16"/>
+              </w:rPr>
+              <w:t>128 × 128 × 3</w:t>
+            </w:r>
+          </w:p>
+        </w:tc>
+        <w:tc>
+          <w:tcPr>
+            <w:tcW w:type="dxa" w:w="1304"/>
+            <w:vAlign w:val="center"/>
+          </w:tcPr>
+          <w:p>
+            <w:pPr>
+              <w:spacing w:after="20" w:before="20"/>
+            </w:pPr>
+            <w:r>
+              <w:rPr>
+                <w:sz w:val="16"/>
+              </w:rPr>
+              <w:t>0</w:t>
+            </w:r>
+          </w:p>
+        </w:tc>
+      </w:tr>
+      <w:tr>
+        <w:trPr>
+          <w:cantSplit/>
+        </w:trPr>
+        <w:tc>
+          <w:tcPr>
+            <w:tcW w:type="dxa" w:w="1417"/>
+            <w:vAlign w:val="center"/>
+            <w:shd w:fill="F2F5F9"/>
+          </w:tcPr>
+          <w:p>
+            <w:pPr>
+              <w:spacing w:after="20" w:before="20"/>
+            </w:pPr>
+            <w:r>
+              <w:rPr>
+                <w:sz w:val="16"/>
+              </w:rPr>
+              <w:t>Rescaling</w:t>
+            </w:r>
+          </w:p>
+        </w:tc>
+        <w:tc>
+          <w:tcPr>
+            <w:tcW w:type="dxa" w:w="3061"/>
+            <w:vAlign w:val="center"/>
+            <w:shd w:fill="F2F5F9"/>
+          </w:tcPr>
+          <w:p>
+            <w:pPr>
+              <w:spacing w:after="20" w:before="20"/>
+            </w:pPr>
+            <w:r>
+              <w:rPr>
+                <w:sz w:val="16"/>
+              </w:rPr>
+              <w:t>píxeis / 255</w:t>
+            </w:r>
+          </w:p>
+        </w:tc>
+        <w:tc>
+          <w:tcPr>
+            <w:tcW w:type="dxa" w:w="1701"/>
+            <w:vAlign w:val="center"/>
+            <w:shd w:fill="F2F5F9"/>
+          </w:tcPr>
+          <w:p>
+            <w:pPr>
+              <w:spacing w:after="20" w:before="20"/>
+            </w:pPr>
+            <w:r>
+              <w:rPr>
+                <w:sz w:val="16"/>
+              </w:rPr>
+              <w:t>128 × 128 × 3</w:t>
+            </w:r>
+          </w:p>
+        </w:tc>
+        <w:tc>
+          <w:tcPr>
+            <w:tcW w:type="dxa" w:w="1304"/>
+            <w:vAlign w:val="center"/>
+            <w:shd w:fill="F2F5F9"/>
+          </w:tcPr>
+          <w:p>
+            <w:pPr>
+              <w:spacing w:after="20" w:before="20"/>
+            </w:pPr>
+            <w:r>
+              <w:rPr>
+                <w:sz w:val="16"/>
+              </w:rPr>
+              <w:t>0</w:t>
+            </w:r>
+          </w:p>
+        </w:tc>
+      </w:tr>
+      <w:tr>
+        <w:trPr>
+          <w:cantSplit/>
+        </w:trPr>
+        <w:tc>
+          <w:tcPr>
+            <w:tcW w:type="dxa" w:w="1417"/>
+            <w:vAlign w:val="center"/>
+          </w:tcPr>
+          <w:p>
+            <w:pPr>
+              <w:spacing w:after="20" w:before="20"/>
+            </w:pPr>
+            <w:r>
+              <w:rPr>
+                <w:sz w:val="16"/>
+              </w:rPr>
+              <w:t>Conv2D</w:t>
+            </w:r>
+          </w:p>
+        </w:tc>
+        <w:tc>
+          <w:tcPr>
+            <w:tcW w:type="dxa" w:w="3061"/>
+            <w:vAlign w:val="center"/>
+          </w:tcPr>
+          <w:p>
+            <w:pPr>
+              <w:spacing w:after="20" w:before="20"/>
+            </w:pPr>
+            <w:r>
+              <w:rPr>
+                <w:sz w:val="16"/>
+              </w:rPr>
+              <w:t>16 filtros 3 × 3; ReLU; valid</w:t>
+            </w:r>
+          </w:p>
+        </w:tc>
+        <w:tc>
+          <w:tcPr>
+            <w:tcW w:type="dxa" w:w="1701"/>
+            <w:vAlign w:val="center"/>
+          </w:tcPr>
+          <w:p>
+            <w:pPr>
+              <w:spacing w:after="20" w:before="20"/>
+            </w:pPr>
+            <w:r>
+              <w:rPr>
+                <w:sz w:val="16"/>
+              </w:rPr>
+              <w:t>126 × 126 × 16</w:t>
+            </w:r>
+          </w:p>
+        </w:tc>
+        <w:tc>
+          <w:tcPr>
+            <w:tcW w:type="dxa" w:w="1304"/>
+            <w:vAlign w:val="center"/>
+          </w:tcPr>
+          <w:p>
+            <w:pPr>
+              <w:spacing w:after="20" w:before="20"/>
+            </w:pPr>
+            <w:r>
+              <w:rPr>
+                <w:sz w:val="16"/>
+              </w:rPr>
+              <w:t>448</w:t>
+            </w:r>
+          </w:p>
+        </w:tc>
+      </w:tr>
+      <w:tr>
+        <w:trPr>
+          <w:cantSplit/>
+        </w:trPr>
+        <w:tc>
+          <w:tcPr>
+            <w:tcW w:type="dxa" w:w="1417"/>
+            <w:vAlign w:val="center"/>
+            <w:shd w:fill="F2F5F9"/>
+          </w:tcPr>
+          <w:p>
+            <w:pPr>
+              <w:spacing w:after="20" w:before="20"/>
+            </w:pPr>
+            <w:r>
+              <w:rPr>
+                <w:sz w:val="16"/>
+              </w:rPr>
+              <w:t>MaxPooling2D</w:t>
+            </w:r>
+          </w:p>
+        </w:tc>
+        <w:tc>
+          <w:tcPr>
+            <w:tcW w:type="dxa" w:w="3061"/>
+            <w:vAlign w:val="center"/>
+            <w:shd w:fill="F2F5F9"/>
+          </w:tcPr>
+          <w:p>
+            <w:pPr>
+              <w:spacing w:after="20" w:before="20"/>
+            </w:pPr>
+            <w:r>
+              <w:rPr>
+                <w:sz w:val="16"/>
+              </w:rPr>
+              <w:t>2 × 2</w:t>
+            </w:r>
+          </w:p>
+        </w:tc>
+        <w:tc>
+          <w:tcPr>
+            <w:tcW w:type="dxa" w:w="1701"/>
+            <w:vAlign w:val="center"/>
+            <w:shd w:fill="F2F5F9"/>
+          </w:tcPr>
+          <w:p>
+            <w:pPr>
+              <w:spacing w:after="20" w:before="20"/>
+            </w:pPr>
+            <w:r>
+              <w:rPr>
+                <w:sz w:val="16"/>
+              </w:rPr>
+              <w:t>63 × 63 × 16</w:t>
+            </w:r>
+          </w:p>
+        </w:tc>
+        <w:tc>
+          <w:tcPr>
+            <w:tcW w:type="dxa" w:w="1304"/>
+            <w:vAlign w:val="center"/>
+            <w:shd w:fill="F2F5F9"/>
+          </w:tcPr>
+          <w:p>
+            <w:pPr>
+              <w:spacing w:after="20" w:before="20"/>
+            </w:pPr>
+            <w:r>
+              <w:rPr>
+                <w:sz w:val="16"/>
+              </w:rPr>
+              <w:t>0</w:t>
+            </w:r>
+          </w:p>
+        </w:tc>
+      </w:tr>
+      <w:tr>
+        <w:trPr>
+          <w:cantSplit/>
+        </w:trPr>
+        <w:tc>
+          <w:tcPr>
+            <w:tcW w:type="dxa" w:w="1417"/>
+            <w:vAlign w:val="center"/>
+          </w:tcPr>
+          <w:p>
+            <w:pPr>
+              <w:spacing w:after="20" w:before="20"/>
+            </w:pPr>
+            <w:r>
+              <w:rPr>
+                <w:sz w:val="16"/>
+              </w:rPr>
+              <w:t>Conv2D</w:t>
+            </w:r>
+          </w:p>
+        </w:tc>
+        <w:tc>
+          <w:tcPr>
+            <w:tcW w:type="dxa" w:w="3061"/>
+            <w:vAlign w:val="center"/>
+          </w:tcPr>
+          <w:p>
+            <w:pPr>
+              <w:spacing w:after="20" w:before="20"/>
+            </w:pPr>
+            <w:r>
+              <w:rPr>
+                <w:sz w:val="16"/>
+              </w:rPr>
+              <w:t>32 filtros 3 × 3; ReLU; valid</w:t>
+            </w:r>
+          </w:p>
+        </w:tc>
+        <w:tc>
+          <w:tcPr>
+            <w:tcW w:type="dxa" w:w="1701"/>
+            <w:vAlign w:val="center"/>
+          </w:tcPr>
+          <w:p>
+            <w:pPr>
+              <w:spacing w:after="20" w:before="20"/>
+            </w:pPr>
+            <w:r>
+              <w:rPr>
+                <w:sz w:val="16"/>
+              </w:rPr>
+              <w:t>61 × 61 × 32</w:t>
+            </w:r>
+          </w:p>
+        </w:tc>
+        <w:tc>
+          <w:tcPr>
+            <w:tcW w:type="dxa" w:w="1304"/>
+            <w:vAlign w:val="center"/>
+          </w:tcPr>
+          <w:p>
+            <w:pPr>
+              <w:spacing w:after="20" w:before="20"/>
+            </w:pPr>
+            <w:r>
+              <w:rPr>
+                <w:sz w:val="16"/>
+              </w:rPr>
+              <w:t>4 640</w:t>
+            </w:r>
+          </w:p>
+        </w:tc>
+      </w:tr>
+      <w:tr>
+        <w:trPr>
+          <w:cantSplit/>
+        </w:trPr>
+        <w:tc>
+          <w:tcPr>
+            <w:tcW w:type="dxa" w:w="1417"/>
+            <w:vAlign w:val="center"/>
+            <w:shd w:fill="F2F5F9"/>
+          </w:tcPr>
+          <w:p>
+            <w:pPr>
+              <w:spacing w:after="20" w:before="20"/>
+            </w:pPr>
+            <w:r>
+              <w:rPr>
+                <w:sz w:val="16"/>
+              </w:rPr>
+              <w:t>MaxPooling2D</w:t>
+            </w:r>
+          </w:p>
+        </w:tc>
+        <w:tc>
+          <w:tcPr>
+            <w:tcW w:type="dxa" w:w="3061"/>
+            <w:vAlign w:val="center"/>
+            <w:shd w:fill="F2F5F9"/>
+          </w:tcPr>
+          <w:p>
+            <w:pPr>
+              <w:spacing w:after="20" w:before="20"/>
+            </w:pPr>
+            <w:r>
+              <w:rPr>
+                <w:sz w:val="16"/>
+              </w:rPr>
+              <w:t>2 × 2</w:t>
+            </w:r>
+          </w:p>
+        </w:tc>
+        <w:tc>
+          <w:tcPr>
+            <w:tcW w:type="dxa" w:w="1701"/>
+            <w:vAlign w:val="center"/>
+            <w:shd w:fill="F2F5F9"/>
+          </w:tcPr>
+          <w:p>
+            <w:pPr>
+              <w:spacing w:after="20" w:before="20"/>
+            </w:pPr>
+            <w:r>
+              <w:rPr>
+                <w:sz w:val="16"/>
+              </w:rPr>
+              <w:t>30 × 30 × 32</w:t>
+            </w:r>
+          </w:p>
+        </w:tc>
+        <w:tc>
+          <w:tcPr>
+            <w:tcW w:type="dxa" w:w="1304"/>
+            <w:vAlign w:val="center"/>
+            <w:shd w:fill="F2F5F9"/>
+          </w:tcPr>
+          <w:p>
+            <w:pPr>
+              <w:spacing w:after="20" w:before="20"/>
+            </w:pPr>
+            <w:r>
+              <w:rPr>
+                <w:sz w:val="16"/>
+              </w:rPr>
+              <w:t>0</w:t>
+            </w:r>
+          </w:p>
+        </w:tc>
+      </w:tr>
+      <w:tr>
+        <w:trPr>
+          <w:cantSplit/>
+        </w:trPr>
+        <w:tc>
+          <w:tcPr>
+            <w:tcW w:type="dxa" w:w="1417"/>
+            <w:vAlign w:val="center"/>
+          </w:tcPr>
+          <w:p>
+            <w:pPr>
+              <w:spacing w:after="20" w:before="20"/>
+            </w:pPr>
+            <w:r>
+              <w:rPr>
+                <w:sz w:val="16"/>
+              </w:rPr>
+              <w:t>Flatten</w:t>
+            </w:r>
+          </w:p>
+        </w:tc>
+        <w:tc>
+          <w:tcPr>
+            <w:tcW w:type="dxa" w:w="3061"/>
+            <w:vAlign w:val="center"/>
+          </w:tcPr>
+          <w:p>
+            <w:pPr>
+              <w:spacing w:after="20" w:before="20"/>
+            </w:pPr>
+            <w:r>
+              <w:rPr>
+                <w:sz w:val="16"/>
+              </w:rPr>
+              <w:t>achatamento</w:t>
+            </w:r>
+          </w:p>
+        </w:tc>
+        <w:tc>
+          <w:tcPr>
+            <w:tcW w:type="dxa" w:w="1701"/>
+            <w:vAlign w:val="center"/>
+          </w:tcPr>
+          <w:p>
+            <w:pPr>
+              <w:spacing w:after="20" w:before="20"/>
+            </w:pPr>
+            <w:r>
+              <w:rPr>
+                <w:sz w:val="16"/>
+              </w:rPr>
+              <w:t>28 800</w:t>
+            </w:r>
+          </w:p>
+        </w:tc>
+        <w:tc>
+          <w:tcPr>
+            <w:tcW w:type="dxa" w:w="1304"/>
+            <w:vAlign w:val="center"/>
+          </w:tcPr>
+          <w:p>
+            <w:pPr>
+              <w:spacing w:after="20" w:before="20"/>
+            </w:pPr>
+            <w:r>
+              <w:rPr>
+                <w:sz w:val="16"/>
+              </w:rPr>
+              <w:t>0</w:t>
+            </w:r>
+          </w:p>
+        </w:tc>
+      </w:tr>
+      <w:tr>
+        <w:trPr>
+          <w:cantSplit/>
+        </w:trPr>
+        <w:tc>
+          <w:tcPr>
+            <w:tcW w:type="dxa" w:w="1417"/>
+            <w:vAlign w:val="center"/>
+            <w:shd w:fill="F2F5F9"/>
+          </w:tcPr>
+          <w:p>
+            <w:pPr>
+              <w:spacing w:after="20" w:before="20"/>
+            </w:pPr>
+            <w:r>
+              <w:rPr>
+                <w:sz w:val="16"/>
+              </w:rPr>
+              <w:t>Dense</w:t>
+            </w:r>
+          </w:p>
+        </w:tc>
+        <w:tc>
+          <w:tcPr>
+            <w:tcW w:type="dxa" w:w="3061"/>
+            <w:vAlign w:val="center"/>
+            <w:shd w:fill="F2F5F9"/>
+          </w:tcPr>
+          <w:p>
+            <w:pPr>
+              <w:spacing w:after="20" w:before="20"/>
+            </w:pPr>
+            <w:r>
+              <w:rPr>
+                <w:sz w:val="16"/>
+              </w:rPr>
+              <w:t>64 neurónios; ReLU</w:t>
+            </w:r>
+          </w:p>
+        </w:tc>
+        <w:tc>
+          <w:tcPr>
+            <w:tcW w:type="dxa" w:w="1701"/>
+            <w:vAlign w:val="center"/>
+            <w:shd w:fill="F2F5F9"/>
+          </w:tcPr>
+          <w:p>
+            <w:pPr>
+              <w:spacing w:after="20" w:before="20"/>
+            </w:pPr>
+            <w:r>
+              <w:rPr>
+                <w:sz w:val="16"/>
+              </w:rPr>
+              <w:t>64</w:t>
+            </w:r>
+          </w:p>
+        </w:tc>
+        <w:tc>
+          <w:tcPr>
+            <w:tcW w:type="dxa" w:w="1304"/>
+            <w:vAlign w:val="center"/>
+            <w:shd w:fill="F2F5F9"/>
+          </w:tcPr>
+          <w:p>
+            <w:pPr>
+              <w:spacing w:after="20" w:before="20"/>
+            </w:pPr>
+            <w:r>
+              <w:rPr>
+                <w:sz w:val="16"/>
+              </w:rPr>
+              <w:t>1 843 264</w:t>
+            </w:r>
+          </w:p>
+        </w:tc>
+      </w:tr>
+      <w:tr>
+        <w:trPr>
+          <w:cantSplit/>
+        </w:trPr>
+        <w:tc>
+          <w:tcPr>
+            <w:tcW w:type="dxa" w:w="1417"/>
+            <w:vAlign w:val="center"/>
+          </w:tcPr>
+          <w:p>
+            <w:pPr>
+              <w:spacing w:after="20" w:before="20"/>
+            </w:pPr>
+            <w:r>
+              <w:rPr>
+                <w:sz w:val="16"/>
+              </w:rPr>
+              <w:t>Dropout</w:t>
+            </w:r>
+          </w:p>
+        </w:tc>
+        <w:tc>
+          <w:tcPr>
+            <w:tcW w:type="dxa" w:w="3061"/>
+            <w:vAlign w:val="center"/>
+          </w:tcPr>
+          <w:p>
+            <w:pPr>
+              <w:spacing w:after="20" w:before="20"/>
+            </w:pPr>
+            <w:r>
+              <w:rPr>
+                <w:sz w:val="16"/>
+              </w:rPr>
+              <w:t>taxa 0,5 no treino</w:t>
+            </w:r>
+          </w:p>
+        </w:tc>
+        <w:tc>
+          <w:tcPr>
+            <w:tcW w:type="dxa" w:w="1701"/>
+            <w:vAlign w:val="center"/>
+          </w:tcPr>
+          <w:p>
+            <w:pPr>
+              <w:spacing w:after="20" w:before="20"/>
+            </w:pPr>
+            <w:r>
+              <w:rPr>
+                <w:sz w:val="16"/>
+              </w:rPr>
+              <w:t>64</w:t>
+            </w:r>
+          </w:p>
+        </w:tc>
+        <w:tc>
+          <w:tcPr>
+            <w:tcW w:type="dxa" w:w="1304"/>
+            <w:vAlign w:val="center"/>
+          </w:tcPr>
+          <w:p>
+            <w:pPr>
+              <w:spacing w:after="20" w:before="20"/>
+            </w:pPr>
+            <w:r>
+              <w:rPr>
+                <w:sz w:val="16"/>
+              </w:rPr>
+              <w:t>0</w:t>
+            </w:r>
+          </w:p>
+        </w:tc>
+      </w:tr>
+      <w:tr>
+        <w:trPr>
+          <w:cantSplit/>
+        </w:trPr>
+        <w:tc>
+          <w:tcPr>
+            <w:tcW w:type="dxa" w:w="1417"/>
+            <w:vAlign w:val="center"/>
+            <w:shd w:fill="F2F5F9"/>
+          </w:tcPr>
+          <w:p>
+            <w:pPr>
+              <w:spacing w:after="20" w:before="20"/>
+            </w:pPr>
+            <w:r>
+              <w:rPr>
+                <w:sz w:val="16"/>
+              </w:rPr>
+              <w:t>Dense</w:t>
+            </w:r>
+          </w:p>
+        </w:tc>
+        <w:tc>
+          <w:tcPr>
+            <w:tcW w:type="dxa" w:w="3061"/>
+            <w:vAlign w:val="center"/>
+            <w:shd w:fill="F2F5F9"/>
+          </w:tcPr>
+          <w:p>
+            <w:pPr>
+              <w:spacing w:after="20" w:before="20"/>
+            </w:pPr>
+            <w:r>
+              <w:rPr>
+                <w:sz w:val="16"/>
+              </w:rPr>
+              <w:t>5 neurónios; softmax</w:t>
+            </w:r>
+          </w:p>
+        </w:tc>
+        <w:tc>
+          <w:tcPr>
+            <w:tcW w:type="dxa" w:w="1701"/>
+            <w:vAlign w:val="center"/>
+            <w:shd w:fill="F2F5F9"/>
+          </w:tcPr>
+          <w:p>
+            <w:pPr>
+              <w:spacing w:after="20" w:before="20"/>
+            </w:pPr>
+            <w:r>
+              <w:rPr>
+                <w:sz w:val="16"/>
+              </w:rPr>
+              <w:t>5</w:t>
+            </w:r>
+          </w:p>
+        </w:tc>
+        <w:tc>
+          <w:tcPr>
+            <w:tcW w:type="dxa" w:w="1304"/>
+            <w:vAlign w:val="center"/>
+            <w:shd w:fill="F2F5F9"/>
+          </w:tcPr>
+          <w:p>
+            <w:pPr>
+              <w:spacing w:after="20" w:before="20"/>
+            </w:pPr>
+            <w:r>
+              <w:rPr>
+                <w:sz w:val="16"/>
+              </w:rPr>
+              <w:t>325</w:t>
+            </w:r>
+          </w:p>
+        </w:tc>
+      </w:tr>
+      <w:tr>
+        <w:trPr>
+          <w:cantSplit/>
+        </w:trPr>
+        <w:tc>
+          <w:tcPr>
+            <w:tcW w:type="dxa" w:w="1417"/>
+            <w:vAlign w:val="center"/>
+          </w:tcPr>
+          <w:p>
+            <w:pPr>
+              <w:spacing w:after="20" w:before="20"/>
+            </w:pPr>
+            <w:r>
+              <w:rPr>
+                <w:sz w:val="16"/>
+              </w:rPr>
+              <w:t>Total</w:t>
+            </w:r>
+          </w:p>
+        </w:tc>
+        <w:tc>
+          <w:tcPr>
+            <w:tcW w:type="dxa" w:w="3061"/>
+            <w:vAlign w:val="center"/>
+          </w:tcPr>
+          <w:p>
+            <w:pPr>
+              <w:spacing w:after="20" w:before="20"/>
+            </w:pPr>
+            <w:r>
+              <w:rPr>
+                <w:sz w:val="16"/>
+              </w:rPr>
+            </w:r>
+          </w:p>
+        </w:tc>
+        <w:tc>
+          <w:tcPr>
+            <w:tcW w:type="dxa" w:w="1701"/>
+            <w:vAlign w:val="center"/>
+          </w:tcPr>
+          <w:p>
+            <w:pPr>
+              <w:spacing w:after="20" w:before="20"/>
+            </w:pPr>
+            <w:r>
+              <w:rPr>
+                <w:sz w:val="16"/>
+              </w:rPr>
+            </w:r>
+          </w:p>
+        </w:tc>
+        <w:tc>
+          <w:tcPr>
+            <w:tcW w:type="dxa" w:w="1304"/>
+            <w:vAlign w:val="center"/>
+          </w:tcPr>
+          <w:p>
+            <w:pPr>
+              <w:spacing w:after="20" w:before="20"/>
             </w:pPr>
             <w:r>
               <w:rPr>
@@ -1029,7 +2585,7 @@
     </w:p>
     <w:p>
       <w:r>
-        <w:t>A MLP recebe todos os píxeis como um vetor. A CNN aprende padrões locais por convoluções e reduz as dimensões espaciais por pooling. A versão com dropout mantém a arquitetura da CNN e desativa aleatoriamente 50% das saídas da camada Dense 64 durante o treino; no teste, o dropout não altera as previsões. O número de parâmetros treináveis mantém-se em 1 848 677.</w:t>
+        <w:t>A camada Dropout desativa aleatoriamente parte das ativações durante o treino e não acrescenta parâmetros. No teste, a rede utiliza todas as ativações. Esta CNN ainda concentra a maioria dos parâmetros na camada Dense depois de Flatten; a experiência de validação mostra se o dropout ajuda a controlar o sobreajuste.</w:t>
       </w:r>
     </w:p>
     <w:p>
@@ -1037,12 +2593,12 @@
         <w:pStyle w:val="Heading2"/>
       </w:pPr>
       <w:r>
-        <w:t>2.2 Comparação controlada</w:t>
+        <w:t>2.4. Experiências e escolha do modelo</w:t>
       </w:r>
     </w:p>
     <w:p>
       <w:r>
-        <w:t>A CNN original apresentou aumento da perda de validação depois das primeiras épocas. Foram comparadas três variações com o mesmo conjunto de dados, batch, taxa de aprendizagem e semente. Todas permitem até 15 épocas e param após duas épocas sem melhoria de val_loss, recuperando os pesos da melhor época: (i) apenas paragem; (ii) paragem e dropout 0,5; (iii) paragem, dropout e aumento de dados com inversão horizontal e rotação até cerca de 18°. O aumento atua apenas no treino. A regra de seleção, definida antes da comparação, foi minimizar val_loss; o teste permaneceu separado.</w:t>
+        <w:t>As duas arquiteturas iniciais foram treinadas durante 10 épocas. Como a CNN inicial apresentou aumento da perda de validação, treinámos três variações da mesma arquitetura: paragem antecipada; paragem com dropout 0,5; e paragem com dropout 0,5 mais inversão horizontal e rotação até cerca de 18° aplicada apenas no treino. Estas variações permitem até 15 épocas, param após duas épocas sem melhoria de val_loss e recuperam os pesos da melhor época. O critério de escolha foi a menor val_loss; as imagens de teste não participaram na escolha.</w:t>
       </w:r>
     </w:p>
     <w:p>
@@ -1058,36 +2614,46 @@
         <w:pStyle w:val="Heading2"/>
       </w:pPr>
       <w:r>
-        <w:t>3.1 Validação e escolha do modelo</w:t>
+        <w:t>3.1. Validação</w:t>
+      </w:r>
+    </w:p>
+    <w:p>
+      <w:r>
+        <w:t>Tabela 4 — Comparação das variações da CNN. Os valores de validação pertencem à época cujos pesos foram guardados.</w:t>
       </w:r>
     </w:p>
     <w:tbl>
       <w:tblPr>
-        <w:tblStyle w:val="LightShading-Accent1"/>
         <w:tblW w:type="auto" w:w="0"/>
         <w:jc w:val="center"/>
+        <w:tblLayout w:type="fixed"/>
         <w:tblLook w:firstColumn="1" w:firstRow="1" w:lastColumn="0" w:lastRow="0" w:noHBand="0" w:noVBand="1" w:val="04A0"/>
       </w:tblPr>
       <w:tblGrid>
-        <w:gridCol w:w="2017"/>
-        <w:gridCol w:w="2017"/>
-        <w:gridCol w:w="2017"/>
-        <w:gridCol w:w="2017"/>
-        <w:gridCol w:w="2017"/>
+        <w:gridCol w:w="1973"/>
+        <w:gridCol w:w="1973"/>
+        <w:gridCol w:w="1973"/>
+        <w:gridCol w:w="1973"/>
+        <w:gridCol w:w="1973"/>
       </w:tblGrid>
       <w:tr>
+        <w:trPr>
+          <w:cantSplit/>
+        </w:trPr>
         <w:tc>
           <w:tcPr>
-            <w:tcW w:type="dxa" w:w="2017"/>
+            <w:tcW w:type="dxa" w:w="1928"/>
+            <w:vAlign w:val="center"/>
+            <w:shd w:fill="DCE5F2"/>
           </w:tcPr>
           <w:p>
             <w:pPr>
-              <w:spacing w:after="20"/>
+              <w:spacing w:after="20" w:before="20"/>
             </w:pPr>
             <w:r>
               <w:rPr>
                 <w:b/>
-                <w:color w:val="1D6147"/>
+                <w:color w:val="2D4571"/>
                 <w:sz w:val="16"/>
               </w:rPr>
               <w:t>Configuração</w:t>
@@ -1096,34 +2662,38 @@
         </w:tc>
         <w:tc>
           <w:tcPr>
-            <w:tcW w:type="dxa" w:w="2017"/>
+            <w:tcW w:type="dxa" w:w="1417"/>
+            <w:vAlign w:val="center"/>
+            <w:shd w:fill="DCE5F2"/>
           </w:tcPr>
           <w:p>
             <w:pPr>
-              <w:spacing w:after="20"/>
+              <w:spacing w:after="20" w:before="20"/>
             </w:pPr>
             <w:r>
               <w:rPr>
                 <w:b/>
-                <w:color w:val="1D6147"/>
+                <w:color w:val="2D4571"/>
                 <w:sz w:val="16"/>
               </w:rPr>
-              <w:t>Épocas</w:t>
+              <w:t>Épocas executadas</w:t>
             </w:r>
           </w:p>
         </w:tc>
         <w:tc>
           <w:tcPr>
-            <w:tcW w:type="dxa" w:w="2017"/>
+            <w:tcW w:type="dxa" w:w="1417"/>
+            <w:vAlign w:val="center"/>
+            <w:shd w:fill="DCE5F2"/>
           </w:tcPr>
           <w:p>
             <w:pPr>
-              <w:spacing w:after="20"/>
+              <w:spacing w:after="20" w:before="20"/>
             </w:pPr>
             <w:r>
               <w:rPr>
                 <w:b/>
-                <w:color w:val="1D6147"/>
+                <w:color w:val="2D4571"/>
                 <w:sz w:val="16"/>
               </w:rPr>
               <w:t>Época guardada</w:t>
@@ -1132,16 +2702,18 @@
         </w:tc>
         <w:tc>
           <w:tcPr>
-            <w:tcW w:type="dxa" w:w="2017"/>
+            <w:tcW w:type="dxa" w:w="1247"/>
+            <w:vAlign w:val="center"/>
+            <w:shd w:fill="DCE5F2"/>
           </w:tcPr>
           <w:p>
             <w:pPr>
-              <w:spacing w:after="20"/>
+              <w:spacing w:after="20" w:before="20"/>
             </w:pPr>
             <w:r>
               <w:rPr>
                 <w:b/>
-                <w:color w:val="1D6147"/>
+                <w:color w:val="2D4571"/>
                 <w:sz w:val="16"/>
               </w:rPr>
               <w:t>val_loss</w:t>
@@ -1150,16 +2722,18 @@
         </w:tc>
         <w:tc>
           <w:tcPr>
-            <w:tcW w:type="dxa" w:w="2017"/>
+            <w:tcW w:type="dxa" w:w="1304"/>
+            <w:vAlign w:val="center"/>
+            <w:shd w:fill="DCE5F2"/>
           </w:tcPr>
           <w:p>
             <w:pPr>
-              <w:spacing w:after="20"/>
+              <w:spacing w:after="20" w:before="20"/>
             </w:pPr>
             <w:r>
               <w:rPr>
                 <w:b/>
-                <w:color w:val="1D6147"/>
+                <w:color w:val="2D4571"/>
                 <w:sz w:val="16"/>
               </w:rPr>
               <w:t>val_accuracy</w:t>
@@ -1168,13 +2742,17 @@
         </w:tc>
       </w:tr>
       <w:tr>
+        <w:trPr>
+          <w:cantSplit/>
+        </w:trPr>
         <w:tc>
           <w:tcPr>
-            <w:tcW w:type="dxa" w:w="2017"/>
+            <w:tcW w:type="dxa" w:w="1928"/>
+            <w:vAlign w:val="center"/>
           </w:tcPr>
           <w:p>
             <w:pPr>
-              <w:spacing w:after="20"/>
+              <w:spacing w:after="20" w:before="20"/>
             </w:pPr>
             <w:r>
               <w:rPr>
@@ -1186,11 +2764,12 @@
         </w:tc>
         <w:tc>
           <w:tcPr>
-            <w:tcW w:type="dxa" w:w="2017"/>
+            <w:tcW w:type="dxa" w:w="1417"/>
+            <w:vAlign w:val="center"/>
           </w:tcPr>
           <w:p>
             <w:pPr>
-              <w:spacing w:after="20"/>
+              <w:spacing w:after="20" w:before="20"/>
             </w:pPr>
             <w:r>
               <w:rPr>
@@ -1202,11 +2781,12 @@
         </w:tc>
         <w:tc>
           <w:tcPr>
-            <w:tcW w:type="dxa" w:w="2017"/>
+            <w:tcW w:type="dxa" w:w="1417"/>
+            <w:vAlign w:val="center"/>
           </w:tcPr>
           <w:p>
             <w:pPr>
-              <w:spacing w:after="20"/>
+              <w:spacing w:after="20" w:before="20"/>
             </w:pPr>
             <w:r>
               <w:rPr>
@@ -1218,11 +2798,12 @@
         </w:tc>
         <w:tc>
           <w:tcPr>
-            <w:tcW w:type="dxa" w:w="2017"/>
+            <w:tcW w:type="dxa" w:w="1247"/>
+            <w:vAlign w:val="center"/>
           </w:tcPr>
           <w:p>
             <w:pPr>
-              <w:spacing w:after="20"/>
+              <w:spacing w:after="20" w:before="20"/>
             </w:pPr>
             <w:r>
               <w:rPr>
@@ -1234,11 +2815,12 @@
         </w:tc>
         <w:tc>
           <w:tcPr>
-            <w:tcW w:type="dxa" w:w="2017"/>
+            <w:tcW w:type="dxa" w:w="1304"/>
+            <w:vAlign w:val="center"/>
           </w:tcPr>
           <w:p>
             <w:pPr>
-              <w:spacing w:after="20"/>
+              <w:spacing w:after="20" w:before="20"/>
             </w:pPr>
             <w:r>
               <w:rPr>
@@ -1250,13 +2832,18 @@
         </w:tc>
       </w:tr>
       <w:tr>
+        <w:trPr>
+          <w:cantSplit/>
+        </w:trPr>
         <w:tc>
           <w:tcPr>
-            <w:tcW w:type="dxa" w:w="2017"/>
+            <w:tcW w:type="dxa" w:w="1928"/>
+            <w:vAlign w:val="center"/>
+            <w:shd w:fill="F2F5F9"/>
           </w:tcPr>
           <w:p>
             <w:pPr>
-              <w:spacing w:after="20"/>
+              <w:spacing w:after="20" w:before="20"/>
             </w:pPr>
             <w:r>
               <w:rPr>
@@ -1268,11 +2855,13 @@
         </w:tc>
         <w:tc>
           <w:tcPr>
-            <w:tcW w:type="dxa" w:w="2017"/>
+            <w:tcW w:type="dxa" w:w="1417"/>
+            <w:vAlign w:val="center"/>
+            <w:shd w:fill="F2F5F9"/>
           </w:tcPr>
           <w:p>
             <w:pPr>
-              <w:spacing w:after="20"/>
+              <w:spacing w:after="20" w:before="20"/>
             </w:pPr>
             <w:r>
               <w:rPr>
@@ -1284,11 +2873,13 @@
         </w:tc>
         <w:tc>
           <w:tcPr>
-            <w:tcW w:type="dxa" w:w="2017"/>
+            <w:tcW w:type="dxa" w:w="1417"/>
+            <w:vAlign w:val="center"/>
+            <w:shd w:fill="F2F5F9"/>
           </w:tcPr>
           <w:p>
             <w:pPr>
-              <w:spacing w:after="20"/>
+              <w:spacing w:after="20" w:before="20"/>
             </w:pPr>
             <w:r>
               <w:rPr>
@@ -1300,11 +2891,13 @@
         </w:tc>
         <w:tc>
           <w:tcPr>
-            <w:tcW w:type="dxa" w:w="2017"/>
+            <w:tcW w:type="dxa" w:w="1247"/>
+            <w:vAlign w:val="center"/>
+            <w:shd w:fill="F2F5F9"/>
           </w:tcPr>
           <w:p>
             <w:pPr>
-              <w:spacing w:after="20"/>
+              <w:spacing w:after="20" w:before="20"/>
             </w:pPr>
             <w:r>
               <w:rPr>
@@ -1316,11 +2909,13 @@
         </w:tc>
         <w:tc>
           <w:tcPr>
-            <w:tcW w:type="dxa" w:w="2017"/>
+            <w:tcW w:type="dxa" w:w="1304"/>
+            <w:vAlign w:val="center"/>
+            <w:shd w:fill="F2F5F9"/>
           </w:tcPr>
           <w:p>
             <w:pPr>
-              <w:spacing w:after="20"/>
+              <w:spacing w:after="20" w:before="20"/>
             </w:pPr>
             <w:r>
               <w:rPr>
@@ -1332,13 +2927,17 @@
         </w:tc>
       </w:tr>
       <w:tr>
+        <w:trPr>
+          <w:cantSplit/>
+        </w:trPr>
         <w:tc>
           <w:tcPr>
-            <w:tcW w:type="dxa" w:w="2017"/>
+            <w:tcW w:type="dxa" w:w="1928"/>
+            <w:vAlign w:val="center"/>
           </w:tcPr>
           <w:p>
             <w:pPr>
-              <w:spacing w:after="20"/>
+              <w:spacing w:after="20" w:before="20"/>
             </w:pPr>
             <w:r>
               <w:rPr>
@@ -1350,11 +2949,12 @@
         </w:tc>
         <w:tc>
           <w:tcPr>
-            <w:tcW w:type="dxa" w:w="2017"/>
+            <w:tcW w:type="dxa" w:w="1417"/>
+            <w:vAlign w:val="center"/>
           </w:tcPr>
           <w:p>
             <w:pPr>
-              <w:spacing w:after="20"/>
+              <w:spacing w:after="20" w:before="20"/>
             </w:pPr>
             <w:r>
               <w:rPr>
@@ -1366,11 +2966,12 @@
         </w:tc>
         <w:tc>
           <w:tcPr>
-            <w:tcW w:type="dxa" w:w="2017"/>
+            <w:tcW w:type="dxa" w:w="1417"/>
+            <w:vAlign w:val="center"/>
           </w:tcPr>
           <w:p>
             <w:pPr>
-              <w:spacing w:after="20"/>
+              <w:spacing w:after="20" w:before="20"/>
             </w:pPr>
             <w:r>
               <w:rPr>
@@ -1382,11 +2983,12 @@
         </w:tc>
         <w:tc>
           <w:tcPr>
-            <w:tcW w:type="dxa" w:w="2017"/>
+            <w:tcW w:type="dxa" w:w="1247"/>
+            <w:vAlign w:val="center"/>
           </w:tcPr>
           <w:p>
             <w:pPr>
-              <w:spacing w:after="20"/>
+              <w:spacing w:after="20" w:before="20"/>
             </w:pPr>
             <w:r>
               <w:rPr>
@@ -1398,11 +3000,12 @@
         </w:tc>
         <w:tc>
           <w:tcPr>
-            <w:tcW w:type="dxa" w:w="2017"/>
+            <w:tcW w:type="dxa" w:w="1304"/>
+            <w:vAlign w:val="center"/>
           </w:tcPr>
           <w:p>
             <w:pPr>
-              <w:spacing w:after="20"/>
+              <w:spacing w:after="20" w:before="20"/>
             </w:pPr>
             <w:r>
               <w:rPr>
@@ -1421,14 +3024,17 @@
     </w:p>
     <w:p>
       <w:r>
-        <w:t>A CNN com dropout teve a menor perda de validação. A sua maior accuracy de validação ocorreu na época 5 (72,64%), mas os pesos guardados pertencem à época 6, pois esta teve a menor perda. Na CNN original, a accuracy de treino chegou a 99,62% na época 10, enquanto a perda de validação subiu para 1,4487; isto sugere sobreajuste. A paragem e o dropout reduziram essa degradação. Nesta execução, o aumento de imagens não melhorou a validação.</w:t>
+        <w:t>A CNN com dropout apresentou a menor val_loss. A sua maior val_accuracy foi 72,64% na época 5, mas os pesos guardados são os da época 6, selecionada pela perda. Na CNN inicial, a accuracy de treino atingiu 99,62% na época 10 enquanto a perda de validação subiu para 1,4487, sinal de sobreajuste. O aumento de dados testado não melhorou a validação nesta execução.</w:t>
       </w:r>
     </w:p>
     <w:p>
+      <w:pPr>
+        <w:keepNext/>
+      </w:pPr>
       <w:r>
         <w:drawing>
           <wp:inline xmlns:a="http://schemas.openxmlformats.org/drawingml/2006/main" xmlns:pic="http://schemas.openxmlformats.org/drawingml/2006/picture">
-            <wp:extent cx="5724000" cy="2042799"/>
+            <wp:extent cx="5400000" cy="1927169"/>
             <wp:docPr id="1" name="Picture 1"/>
             <wp:cNvGraphicFramePr>
               <a:graphicFrameLocks noChangeAspect="1"/>
@@ -1449,7 +3055,7 @@
                   <pic:spPr>
                     <a:xfrm>
                       <a:off x="0" y="0"/>
-                      <a:ext cx="5724000" cy="2042799"/>
+                      <a:ext cx="5400000" cy="1927169"/>
                     </a:xfrm>
                     <a:prstGeom prst="rect"/>
                   </pic:spPr>
@@ -1467,15 +3073,10 @@
       <w:r>
         <w:rPr>
           <w:i/>
-          <w:color w:val="505A58"/>
+          <w:color w:val="4D545E"/>
           <w:sz w:val="16"/>
         </w:rPr>
-        <w:t>Figura 1 — Históricos de validação das CNN. A linha da CNN original prossegue até à época 10.</w:t>
-      </w:r>
-    </w:p>
-    <w:p>
-      <w:r>
-        <w:br w:type="page"/>
+        <w:t>Figura 1 — Evolução da perda e accuracy de validação nas CNN; a original prosseguiu até à época 10.</w:t>
       </w:r>
     </w:p>
     <w:p>
@@ -1483,42 +3084,52 @@
         <w:pStyle w:val="Heading2"/>
       </w:pPr>
       <w:r>
-        <w:t>3.2 Avaliação no teste independente</w:t>
+        <w:t>3.2. Teste independente</w:t>
       </w:r>
     </w:p>
     <w:p>
       <w:r>
-        <w:t>Depois de escolher a CNN com dropout pela validação, avaliou-se essa CNN e a MLP original nas mesmas 1 100 imagens de teste, 220 por espécie. As métricas por classe usam a classe em análise contra as outras quatro; os valores macro são médias simples das cinco classes. Por serem equilibradas, a accuracy e o recall macro coincidem. A AUC mede a ordenação das probabilidades, e não a fração de previsões corretas.</w:t>
+        <w:t>Depois da escolha por validação, a MLP inicial e a CNN com dropout foram avaliadas nas mesmas 1 100 imagens de teste, 220 por espécie. Recall, especificidade, F1 e AUC foram calculados para cada classe contra as restantes e resumidos por média macro. A AUC mede a ordenação das probabilidades; não equivale à percentagem de acertos. Como o teste é equilibrado, accuracy e recall macro coincidem.</w:t>
+      </w:r>
+    </w:p>
+    <w:p>
+      <w:r>
+        <w:t>Tabela 5 — Métricas globais no teste independente; fonte: resultados/avaliacao_teste.txt.</w:t>
       </w:r>
     </w:p>
     <w:tbl>
       <w:tblPr>
-        <w:tblStyle w:val="LightShading-Accent1"/>
         <w:tblW w:type="auto" w:w="0"/>
         <w:jc w:val="center"/>
+        <w:tblLayout w:type="fixed"/>
         <w:tblLook w:firstColumn="1" w:firstRow="1" w:lastColumn="0" w:lastRow="0" w:noHBand="0" w:noVBand="1" w:val="04A0"/>
       </w:tblPr>
       <w:tblGrid>
-        <w:gridCol w:w="1681"/>
-        <w:gridCol w:w="1681"/>
-        <w:gridCol w:w="1681"/>
-        <w:gridCol w:w="1681"/>
-        <w:gridCol w:w="1681"/>
-        <w:gridCol w:w="1681"/>
+        <w:gridCol w:w="1644"/>
+        <w:gridCol w:w="1644"/>
+        <w:gridCol w:w="1644"/>
+        <w:gridCol w:w="1644"/>
+        <w:gridCol w:w="1644"/>
+        <w:gridCol w:w="1644"/>
       </w:tblGrid>
       <w:tr>
+        <w:trPr>
+          <w:cantSplit/>
+        </w:trPr>
         <w:tc>
           <w:tcPr>
-            <w:tcW w:type="dxa" w:w="1681"/>
+            <w:tcW w:type="dxa" w:w="1701"/>
+            <w:vAlign w:val="center"/>
+            <w:shd w:fill="DCE5F2"/>
           </w:tcPr>
           <w:p>
             <w:pPr>
-              <w:spacing w:after="20"/>
+              <w:spacing w:after="20" w:before="20"/>
             </w:pPr>
             <w:r>
               <w:rPr>
                 <w:b/>
-                <w:color w:val="1D6147"/>
+                <w:color w:val="2D4571"/>
                 <w:sz w:val="16"/>
               </w:rPr>
               <w:t>Modelo</w:t>
@@ -1527,16 +3138,18 @@
         </w:tc>
         <w:tc>
           <w:tcPr>
-            <w:tcW w:type="dxa" w:w="1681"/>
+            <w:tcW w:type="dxa" w:w="1134"/>
+            <w:vAlign w:val="center"/>
+            <w:shd w:fill="DCE5F2"/>
           </w:tcPr>
           <w:p>
             <w:pPr>
-              <w:spacing w:after="20"/>
+              <w:spacing w:after="20" w:before="20"/>
             </w:pPr>
             <w:r>
               <w:rPr>
                 <w:b/>
-                <w:color w:val="1D6147"/>
+                <w:color w:val="2D4571"/>
                 <w:sz w:val="16"/>
               </w:rPr>
               <w:t>Accuracy</w:t>
@@ -1545,16 +3158,18 @@
         </w:tc>
         <w:tc>
           <w:tcPr>
-            <w:tcW w:type="dxa" w:w="1681"/>
+            <w:tcW w:type="dxa" w:w="1134"/>
+            <w:vAlign w:val="center"/>
+            <w:shd w:fill="DCE5F2"/>
           </w:tcPr>
           <w:p>
             <w:pPr>
-              <w:spacing w:after="20"/>
+              <w:spacing w:after="20" w:before="20"/>
             </w:pPr>
             <w:r>
               <w:rPr>
                 <w:b/>
-                <w:color w:val="1D6147"/>
+                <w:color w:val="2D4571"/>
                 <w:sz w:val="16"/>
               </w:rPr>
               <w:t>Recall</w:t>
@@ -1563,16 +3178,18 @@
         </w:tc>
         <w:tc>
           <w:tcPr>
-            <w:tcW w:type="dxa" w:w="1681"/>
+            <w:tcW w:type="dxa" w:w="1417"/>
+            <w:vAlign w:val="center"/>
+            <w:shd w:fill="DCE5F2"/>
           </w:tcPr>
           <w:p>
             <w:pPr>
-              <w:spacing w:after="20"/>
+              <w:spacing w:after="20" w:before="20"/>
             </w:pPr>
             <w:r>
               <w:rPr>
                 <w:b/>
-                <w:color w:val="1D6147"/>
+                <w:color w:val="2D4571"/>
                 <w:sz w:val="16"/>
               </w:rPr>
               <w:t>Especificidade</w:t>
@@ -1581,16 +3198,18 @@
         </w:tc>
         <w:tc>
           <w:tcPr>
-            <w:tcW w:type="dxa" w:w="1681"/>
+            <w:tcW w:type="dxa" w:w="1020"/>
+            <w:vAlign w:val="center"/>
+            <w:shd w:fill="DCE5F2"/>
           </w:tcPr>
           <w:p>
             <w:pPr>
-              <w:spacing w:after="20"/>
+              <w:spacing w:after="20" w:before="20"/>
             </w:pPr>
             <w:r>
               <w:rPr>
                 <w:b/>
-                <w:color w:val="1D6147"/>
+                <w:color w:val="2D4571"/>
                 <w:sz w:val="16"/>
               </w:rPr>
               <w:t>F1</w:t>
@@ -1599,16 +3218,18 @@
         </w:tc>
         <w:tc>
           <w:tcPr>
-            <w:tcW w:type="dxa" w:w="1681"/>
+            <w:tcW w:type="dxa" w:w="1020"/>
+            <w:vAlign w:val="center"/>
+            <w:shd w:fill="DCE5F2"/>
           </w:tcPr>
           <w:p>
             <w:pPr>
-              <w:spacing w:after="20"/>
+              <w:spacing w:after="20" w:before="20"/>
             </w:pPr>
             <w:r>
               <w:rPr>
                 <w:b/>
-                <w:color w:val="1D6147"/>
+                <w:color w:val="2D4571"/>
                 <w:sz w:val="16"/>
               </w:rPr>
               <w:t>AUC</w:t>
@@ -1617,13 +3238,17 @@
         </w:tc>
       </w:tr>
       <w:tr>
+        <w:trPr>
+          <w:cantSplit/>
+        </w:trPr>
         <w:tc>
           <w:tcPr>
-            <w:tcW w:type="dxa" w:w="1681"/>
+            <w:tcW w:type="dxa" w:w="1701"/>
+            <w:vAlign w:val="center"/>
           </w:tcPr>
           <w:p>
             <w:pPr>
-              <w:spacing w:after="20"/>
+              <w:spacing w:after="20" w:before="20"/>
             </w:pPr>
             <w:r>
               <w:rPr>
@@ -1635,11 +3260,12 @@
         </w:tc>
         <w:tc>
           <w:tcPr>
-            <w:tcW w:type="dxa" w:w="1681"/>
+            <w:tcW w:type="dxa" w:w="1134"/>
+            <w:vAlign w:val="center"/>
           </w:tcPr>
           <w:p>
             <w:pPr>
-              <w:spacing w:after="20"/>
+              <w:spacing w:after="20" w:before="20"/>
             </w:pPr>
             <w:r>
               <w:rPr>
@@ -1651,11 +3277,12 @@
         </w:tc>
         <w:tc>
           <w:tcPr>
-            <w:tcW w:type="dxa" w:w="1681"/>
+            <w:tcW w:type="dxa" w:w="1134"/>
+            <w:vAlign w:val="center"/>
           </w:tcPr>
           <w:p>
             <w:pPr>
-              <w:spacing w:after="20"/>
+              <w:spacing w:after="20" w:before="20"/>
             </w:pPr>
             <w:r>
               <w:rPr>
@@ -1667,11 +3294,12 @@
         </w:tc>
         <w:tc>
           <w:tcPr>
-            <w:tcW w:type="dxa" w:w="1681"/>
+            <w:tcW w:type="dxa" w:w="1417"/>
+            <w:vAlign w:val="center"/>
           </w:tcPr>
           <w:p>
             <w:pPr>
-              <w:spacing w:after="20"/>
+              <w:spacing w:after="20" w:before="20"/>
             </w:pPr>
             <w:r>
               <w:rPr>
@@ -1683,11 +3311,12 @@
         </w:tc>
         <w:tc>
           <w:tcPr>
-            <w:tcW w:type="dxa" w:w="1681"/>
+            <w:tcW w:type="dxa" w:w="1020"/>
+            <w:vAlign w:val="center"/>
           </w:tcPr>
           <w:p>
             <w:pPr>
-              <w:spacing w:after="20"/>
+              <w:spacing w:after="20" w:before="20"/>
             </w:pPr>
             <w:r>
               <w:rPr>
@@ -1699,11 +3328,12 @@
         </w:tc>
         <w:tc>
           <w:tcPr>
-            <w:tcW w:type="dxa" w:w="1681"/>
+            <w:tcW w:type="dxa" w:w="1020"/>
+            <w:vAlign w:val="center"/>
           </w:tcPr>
           <w:p>
             <w:pPr>
-              <w:spacing w:after="20"/>
+              <w:spacing w:after="20" w:before="20"/>
             </w:pPr>
             <w:r>
               <w:rPr>
@@ -1715,13 +3345,18 @@
         </w:tc>
       </w:tr>
       <w:tr>
+        <w:trPr>
+          <w:cantSplit/>
+        </w:trPr>
         <w:tc>
           <w:tcPr>
-            <w:tcW w:type="dxa" w:w="1681"/>
+            <w:tcW w:type="dxa" w:w="1701"/>
+            <w:vAlign w:val="center"/>
+            <w:shd w:fill="F2F5F9"/>
           </w:tcPr>
           <w:p>
             <w:pPr>
-              <w:spacing w:after="20"/>
+              <w:spacing w:after="20" w:before="20"/>
             </w:pPr>
             <w:r>
               <w:rPr>
@@ -1733,11 +3368,13 @@
         </w:tc>
         <w:tc>
           <w:tcPr>
-            <w:tcW w:type="dxa" w:w="1681"/>
+            <w:tcW w:type="dxa" w:w="1134"/>
+            <w:vAlign w:val="center"/>
+            <w:shd w:fill="F2F5F9"/>
           </w:tcPr>
           <w:p>
             <w:pPr>
-              <w:spacing w:after="20"/>
+              <w:spacing w:after="20" w:before="20"/>
             </w:pPr>
             <w:r>
               <w:rPr>
@@ -1749,11 +3386,13 @@
         </w:tc>
         <w:tc>
           <w:tcPr>
-            <w:tcW w:type="dxa" w:w="1681"/>
+            <w:tcW w:type="dxa" w:w="1134"/>
+            <w:vAlign w:val="center"/>
+            <w:shd w:fill="F2F5F9"/>
           </w:tcPr>
           <w:p>
             <w:pPr>
-              <w:spacing w:after="20"/>
+              <w:spacing w:after="20" w:before="20"/>
             </w:pPr>
             <w:r>
               <w:rPr>
@@ -1765,11 +3404,13 @@
         </w:tc>
         <w:tc>
           <w:tcPr>
-            <w:tcW w:type="dxa" w:w="1681"/>
+            <w:tcW w:type="dxa" w:w="1417"/>
+            <w:vAlign w:val="center"/>
+            <w:shd w:fill="F2F5F9"/>
           </w:tcPr>
           <w:p>
             <w:pPr>
-              <w:spacing w:after="20"/>
+              <w:spacing w:after="20" w:before="20"/>
             </w:pPr>
             <w:r>
               <w:rPr>
@@ -1781,11 +3422,13 @@
         </w:tc>
         <w:tc>
           <w:tcPr>
-            <w:tcW w:type="dxa" w:w="1681"/>
+            <w:tcW w:type="dxa" w:w="1020"/>
+            <w:vAlign w:val="center"/>
+            <w:shd w:fill="F2F5F9"/>
           </w:tcPr>
           <w:p>
             <w:pPr>
-              <w:spacing w:after="20"/>
+              <w:spacing w:after="20" w:before="20"/>
             </w:pPr>
             <w:r>
               <w:rPr>
@@ -1797,11 +3440,13 @@
         </w:tc>
         <w:tc>
           <w:tcPr>
-            <w:tcW w:type="dxa" w:w="1681"/>
+            <w:tcW w:type="dxa" w:w="1020"/>
+            <w:vAlign w:val="center"/>
+            <w:shd w:fill="F2F5F9"/>
           </w:tcPr>
           <w:p>
             <w:pPr>
-              <w:spacing w:after="20"/>
+              <w:spacing w:after="20" w:before="20"/>
             </w:pPr>
             <w:r>
               <w:rPr>
@@ -1820,14 +3465,17 @@
     </w:p>
     <w:p>
       <w:r>
-        <w:t>A CNN acertou 814 imagens, contra 523 da MLP: mais 291 acertos e 26,45 pontos percentuais de accuracy. Os 74,00% no teste estão próximos dos 72,18% de validação na época escolhida, o que apoia a generalização dentro deste dataset. Esta proximidade não prova o mesmo desempenho em fotografias recolhidas por caminhantes noutros contextos.</w:t>
+        <w:t>A CNN acertou 814 imagens e a MLP 523: mais 291 acertos, ou 26,45 pontos percentuais de accuracy. A accuracy de teste da CNN (74,00%) é próxima da accuracy de validação da época escolhida (72,18%), o que apoia a generalização neste subconjunto. Isto não demonstra igual desempenho em fotografias futuras tiradas durante caminhadas.</w:t>
       </w:r>
     </w:p>
     <w:p>
+      <w:pPr>
+        <w:keepNext/>
+      </w:pPr>
       <w:r>
         <w:drawing>
           <wp:inline xmlns:a="http://schemas.openxmlformats.org/drawingml/2006/main" xmlns:pic="http://schemas.openxmlformats.org/drawingml/2006/picture">
-            <wp:extent cx="5688000" cy="2720507"/>
+            <wp:extent cx="5652000" cy="2703289"/>
             <wp:docPr id="2" name="Picture 2"/>
             <wp:cNvGraphicFramePr>
               <a:graphicFrameLocks noChangeAspect="1"/>
@@ -1848,7 +3496,7 @@
                   <pic:spPr>
                     <a:xfrm>
                       <a:off x="0" y="0"/>
-                      <a:ext cx="5688000" cy="2720507"/>
+                      <a:ext cx="5652000" cy="2703289"/>
                     </a:xfrm>
                     <a:prstGeom prst="rect"/>
                   </pic:spPr>
@@ -1866,10 +3514,10 @@
       <w:r>
         <w:rPr>
           <w:i/>
-          <w:color w:val="505A58"/>
+          <w:color w:val="4D545E"/>
           <w:sz w:val="16"/>
         </w:rPr>
-        <w:t>Figura 2 — Matrizes de confusão no teste (contagens). Ger.=gerânio; Alf.=alfazema; Pap.=papoila; Tre.=trevo-branco; Mor.=morangueiro.</w:t>
+        <w:t>Figura 2 — Matrizes de confusão no teste. Linhas: classe real; colunas: classe prevista.</w:t>
       </w:r>
     </w:p>
     <w:p>
@@ -1877,17 +3525,22 @@
         <w:pStyle w:val="Heading2"/>
       </w:pPr>
       <w:r>
-        <w:t>3.3 Erros e limitações</w:t>
+        <w:t>3.3. Interpretação dos erros e limites</w:t>
       </w:r>
     </w:p>
     <w:p>
       <w:r>
-        <w:t>A MLP previu trevo-branco para 562 imagens e reconheceu apenas 19 dos 220 morangueiros (recall de 8,64%); classificou 165 morangueiros como trevo-branco. A CNN reduziu essa tendência, mas classificou 61 trevos como morangueiro e 45 gerânios como morangueiro. Na CNN, a alfazema teve o maior recall (89,55%) e o trevo-branco o menor (62,27%). As matrizes mostram quais classes se confundem; sem inspeção visual individual, não é possível atribuir essas falhas a órgãos, fundos, iluminação ou eventuais rótulos incorretos.</w:t>
+        <w:t>A MLP previu trevo-branco para 562 fotografias; acertou apenas 19 dos 220 morangueiros e confundiu 165 morangueiros com trevo-branco. A CNN reduziu este padrão, mas confundiu 61 trevos com morangueiro e 45 gerânios com morangueiro. Na CNN, a alfazema teve o maior recall (89,55%) e o trevo-branco o menor (62,27%). A matriz indica onde ocorrem os erros, mas não permite atribuí-los com segurança a folhas, flores, fundo ou rótulos sem examinar individualmente essas imagens.</w:t>
       </w:r>
     </w:p>
     <w:p>
       <w:r>
-        <w:t>O problema é fechado: toda a fotografia recebe uma das cinco classes, mesmo que a espécie real esteja fora delas. Não existe ainda uma regra calibrada para resultado inconclusivo nem uma base de dados de riscos de ingestão ou contacto. As fotografias do Pl@ntNet podem diferir das imagens obtidas em caminhadas, e a verificação da amostra não substitui uma auditoria de todos os rótulos. Portanto, o modelo não deve ser usado para decidir se uma planta é comestível ou segura.</w:t>
+        <w:t>O modelo tem saída fechada: uma espécie fora das cinco classes receberá mesmo assim um dos cinco nomes. O dataset provém de observações do Pl@ntNet e pode diferir das imagens de utilizadores do HikeFlora. Também não há regra calibrada para resposta inconclusiva nem informação validada sobre riscos de ingestão ou contacto. Estas limitações impedem usar o classificador como conselho de segurança.</w:t>
+      </w:r>
+    </w:p>
+    <w:p>
+      <w:r>
+        <w:br w:type="page"/>
       </w:r>
     </w:p>
     <w:p>
@@ -1900,12 +3553,12 @@
     </w:p>
     <w:p>
       <w:r>
-        <w:t>Neste subconjunto equilibrado, a CNN com dropout superou claramente a MLP em todas as métricas globais do teste. As convoluções aplicam filtros locais partilhados; a MLP recebe os píxeis achatados e não incorpora essa estrutura na arquitetura. A experiência não isola todas as causas da diferença. A escolha por validação antes do teste evitou usar o teste para ajustar o modelo. O HikeFlora dispõe assim de um classificador inicial para cinco espécies, mas ainda apresenta confusões relevantes e não identifica plantas fora dessas classes.</w:t>
+        <w:t>No subconjunto equilibrado de cinco espécies, a CNN com dropout superou a MLP nas métricas globais do teste independente. As convoluções captam padrões locais; a MLP recebe um vetor de píxeis sem essa estrutura na arquitetura. A diferença observada não isola todas as causas de desempenho, mas mostra a vantagem da solução CNN testada neste problema. A escolha foi feita pela validação antes do teste, e os 74,00% de accuracy não eliminam confusões relevantes entre espécies.</w:t>
       </w:r>
     </w:p>
     <w:p>
       <w:r>
-        <w:t>Nas Metas II e III oficiais, recomenda-se analisar fotografias mal classificadas, comparar modelos mais robustos, estudar calibração e rejeição de espécies desconhecidas e só depois desenvolver as fichas informativas e o protótipo. A informação de risco deve vir de fontes documentadas, não da previsão visual isolada.</w:t>
+        <w:t>Para as próximas metas, interessa inspecionar os erros por imagem, estudar alternativas de arquitetura e definir uma resposta para espécies desconhecidas. A aplicação só deverá apresentar fichas sobre ingestão e contacto com fontes próprias e verificadas, separadas da previsão visual.</w:t>
       </w:r>
     </w:p>
     <w:p>
@@ -1933,14 +3586,19 @@
     </w:p>
     <w:p>
       <w:r>
-        <w:t>[4] TensorFlow/Keras, documentação da API tf.keras, https://www.tensorflow.org/api_docs/python/tf/keras (consulta: 10/10/2026).</w:t>
+        <w:t>[4] C. Garcin et al., «Pl@ntNet-300K: a plant image dataset with high label ambiguity and a long-tailed distribution», NeurIPS Datasets and Benchmarks, 2021, https://datasets-benchmarks-proceedings.neurips.cc/paper/2021/file/7e7757b1e12abcb736ab9a754ffb617a-Paper-round2.pdf.</w:t>
+      </w:r>
+    </w:p>
+    <w:p>
+      <w:r>
+        <w:t>[5] TensorFlow/Keras, documentação da API tf.keras, https://www.tensorflow.org/api_docs/python/tf/keras (consulta: 10/10/2026).</w:t>
       </w:r>
     </w:p>
     <w:sectPr>
       <w:headerReference w:type="default" r:id="rId9"/>
       <w:footerReference w:type="default" r:id="rId10"/>
-      <w:pgSz w:w="12240" w:h="15840"/>
-      <w:pgMar w:top="964" w:right="1077" w:bottom="879" w:left="1077" w:header="720" w:footer="720" w:gutter="0"/>
+      <w:pgSz w:w="11906" w:h="16838"/>
+      <w:pgMar w:top="964" w:right="1020" w:bottom="879" w:left="1020" w:header="720" w:footer="720" w:gutter="0"/>
       <w:cols w:space="720"/>
       <w:docGrid w:linePitch="360"/>
     </w:sectPr>
@@ -1957,7 +3615,7 @@
     </w:pPr>
     <w:r>
       <w:rPr>
-        <w:color w:val="505A58"/>
+        <w:color w:val="4D545E"/>
         <w:sz w:val="16"/>
       </w:rPr>
       <w:t xml:space="preserve">HikeFlora · 2026/27   |   </w:t>
@@ -1970,10 +3628,12 @@
 <file path=word/header1.xml><?xml version="1.0" encoding="utf-8"?>
 <w:hdr xmlns:m="http://schemas.openxmlformats.org/officeDocument/2006/math" xmlns:mc="http://schemas.openxmlformats.org/markup-compatibility/2006" xmlns:mo="http://schemas.microsoft.com/office/mac/office/2008/main" xmlns:mv="urn:schemas-microsoft-com:mac:vml" xmlns:o="urn:schemas-microsoft-com:office:office" xmlns:r="http://schemas.openxmlformats.org/officeDocument/2006/relationships" xmlns:v="urn:schemas-microsoft-com:vml" xmlns:w10="urn:schemas-microsoft-com:office:word" xmlns:w14="http://schemas.microsoft.com/office/word/2010/wordml" xmlns:w="http://schemas.openxmlformats.org/wordprocessingml/2006/main" xmlns:wne="http://schemas.microsoft.com/office/word/2006/wordml" xmlns:wp14="http://schemas.microsoft.com/office/word/2010/wordprocessingDrawing" xmlns:wp="http://schemas.openxmlformats.org/drawingml/2006/wordprocessingDrawing" xmlns:wpc="http://schemas.microsoft.com/office/word/2010/wordprocessingCanvas" xmlns:wpg="http://schemas.microsoft.com/office/word/2010/wordprocessingGroup" xmlns:wpi="http://schemas.microsoft.com/office/word/2010/wordprocessingInk" xmlns:wps="http://schemas.microsoft.com/office/word/2010/wordprocessingShape" mc:Ignorable="w14 wp14">
   <w:p>
-    <w:pPr/>
+    <w:pPr>
+      <w:pStyle w:val="Header"/>
+    </w:pPr>
     <w:r>
       <w:rPr>
-        <w:color w:val="505A58"/>
+        <w:color w:val="4D545E"/>
         <w:sz w:val="15"/>
       </w:rPr>
       <w:t>HIKEFLORA  /  INTELIGÊNCIA COMPUTACIONAL  /  META I</w:t>
@@ -2350,7 +4010,7 @@
     </w:pPr>
     <w:rPr>
       <w:rFonts w:ascii="Liberation Sans" w:hAnsi="Liberation Sans"/>
-      <w:sz w:val="19"/>
+      <w:sz w:val="20"/>
     </w:rPr>
   </w:style>
   <w:style w:type="paragraph" w:styleId="Header">
@@ -2408,14 +4068,14 @@
     <w:pPr>
       <w:keepNext/>
       <w:keepLines/>
-      <w:spacing w:before="200" w:after="100"/>
+      <w:spacing w:before="180" w:after="80"/>
       <w:outlineLvl w:val="0"/>
     </w:pPr>
     <w:rPr>
       <w:rFonts w:asciiTheme="majorHAnsi" w:eastAsiaTheme="majorEastAsia" w:hAnsiTheme="majorHAnsi" w:cstheme="majorBidi" w:ascii="Liberation Sans" w:hAnsi="Liberation Sans"/>
       <w:b/>
       <w:bCs/>
-      <w:color w:val="1D6147"/>
+      <w:color w:val="2D4571"/>
       <w:sz w:val="30"/>
       <w:szCs w:val="28"/>
     </w:rPr>
@@ -2432,14 +4092,14 @@
     <w:pPr>
       <w:keepNext/>
       <w:keepLines/>
-      <w:spacing w:before="200" w:after="100"/>
+      <w:spacing w:before="180" w:after="80"/>
       <w:outlineLvl w:val="1"/>
     </w:pPr>
     <w:rPr>
       <w:rFonts w:asciiTheme="majorHAnsi" w:eastAsiaTheme="majorEastAsia" w:hAnsiTheme="majorHAnsi" w:cstheme="majorBidi" w:ascii="Liberation Sans" w:hAnsi="Liberation Sans"/>
       <w:b/>
       <w:bCs/>
-      <w:color w:val="1D6147"/>
+      <w:color w:val="2D4571"/>
       <w:sz w:val="22"/>
       <w:szCs w:val="26"/>
     </w:rPr>
@@ -2694,16 +4354,17 @@
     <w:qFormat/>
     <w:rsid w:val="00FC693F"/>
     <w:pPr>
+      <w:keepNext/>
       <w:pBdr>
         <w:bottom w:val="single" w:sz="8" w:space="4" w:color="4F81BD" w:themeColor="accent1"/>
       </w:pBdr>
-      <w:spacing w:after="100" w:line="240" w:lineRule="auto" w:before="200"/>
+      <w:spacing w:after="80" w:line="240" w:lineRule="auto" w:before="180"/>
       <w:contextualSpacing/>
     </w:pPr>
     <w:rPr>
       <w:rFonts w:asciiTheme="majorHAnsi" w:eastAsiaTheme="majorEastAsia" w:hAnsiTheme="majorHAnsi" w:cstheme="majorBidi" w:ascii="Liberation Sans" w:hAnsi="Liberation Sans"/>
       <w:b/>
-      <w:color w:val="1D6147"/>
+      <w:color w:val="2D4571"/>
       <w:spacing w:val="5"/>
       <w:kern w:val="28"/>
       <w:sz w:val="50"/>

</xml_diff>

<commit_message>
Consolidar notas e marcar revisoes no relatorio
</commit_message>
<xml_diff>
--- a/entrega/relatorio_meta1.docx
+++ b/entrega/relatorio_meta1.docx
@@ -1042,6 +1042,18 @@
     <w:p>
       <w:r>
         <w:t>O morangueiro cultivado (ID 641) foi substituído pelo morangueiro silvestre (ID 237), pois o primeiro tinha apenas 343 imagens no conjunto original. O manifesto selecao_imagens.csv identifica exatamente as 11 000 fotografias selecionadas com semente 42: 2 200 por classe e uma divisão de 80%/10%/10%. Foram preservadas as partições oficiais; não se repetem identificadores de imagem nem de observação entre os três conjuntos.</w:t>
+      </w:r>
+    </w:p>
+    <w:p>
+      <w:r>
+        <w:rPr>
+          <w:b/>
+          <w:highlight w:val="yellow"/>
+        </w:rPr>
+        <w:t xml:space="preserve">REVER — </w:t>
+      </w:r>
+      <w:r>
+        <w:t>Os metadados oficiais disponibilizam 20 770 fotografias para as cinco espécies escolhidas: 3 318 de gerânio, 3 423 de alfazema, 5 008 de papoila, 4 193 de trevo-branco e 4 828 de morangueiro silvestre. A seleção de 2 200 por espécie equilibra classes inicialmente desiguais. Confirmar se estes totais de origem devem constar da versão final.</w:t>
       </w:r>
     </w:p>
     <w:p>
@@ -3028,6 +3040,18 @@
       </w:r>
     </w:p>
     <w:p>
+      <w:r>
+        <w:rPr>
+          <w:b/>
+          <w:highlight w:val="yellow"/>
+        </w:rPr>
+        <w:t xml:space="preserve">REVER — </w:t>
+      </w:r>
+      <w:r>
+        <w:t>Na CNN inicial, a accuracy de validação atingiu 72,09% na época 4 e terminou em 70,55% na época 10, enquanto a accuracy de treino chegou a 99,62%. Estes valores do histórico tornam mais visível a diferença entre treino e validação.</w:t>
+      </w:r>
+    </w:p>
+    <w:p>
       <w:pPr>
         <w:keepNext/>
       </w:pPr>
@@ -3540,6 +3564,18 @@
     </w:p>
     <w:p>
       <w:r>
+        <w:rPr>
+          <w:b/>
+          <w:highlight w:val="yellow"/>
+        </w:rPr>
+        <w:t xml:space="preserve">REVER — </w:t>
+      </w:r>
+      <w:r>
+        <w:t>As notas de inspeção visual mencionam imagens em ambiente natural, plantas em vasos e exemplares arrancados. Confirmar quantas imagens foram revistas e se estes casos devem ilustrar a diferença entre o dataset e as fotografias esperadas de caminhantes.</w:t>
+      </w:r>
+    </w:p>
+    <w:p>
+      <w:r>
         <w:br w:type="page"/>
       </w:r>
     </w:p>

</xml_diff>